<commit_message>
docs(entrega): actualizar informe de pruebas a 77 tests reales (cobertura 73.15%)
Tras integrar master, las suites pricing/payments/geocoding/rateLimit ya estan
commiteadas. El informe pasa de 10 a 77 pruebas (71 Jest + 6 node:test), todas
verdes, con la cobertura real por archivo. Verificado con npx jest --coverage y npm test.

Co-Authored-By: Claude Opus 4.8 <noreply@anthropic.com>
</commit_message>
<xml_diff>
--- a/ENTREGA_PARCIAL3/03_Informe_Pruebas.docx
+++ b/ENTREGA_PARCIAL3/03_Informe_Pruebas.docx
@@ -38,7 +38,7 @@
           <w:sz w:val="22"/>
           <w:szCs w:val="22"/>
         </w:rPr>
-        <w:t xml:space="preserve">Pruebas unitarias y de integración</w:t>
+        <w:t xml:space="preserve">Pruebas unitarias, de dominio y de integración</w:t>
       </w:r>
     </w:p>
     <w:p>
@@ -280,7 +280,7 @@
                 <w:b w:val="false"/>
                 <w:bCs w:val="false"/>
               </w:rPr>
-              <w:t xml:space="preserve">1.0</w:t>
+              <w:t xml:space="preserve">2.0</w:t>
             </w:r>
           </w:p>
         </w:tc>
@@ -412,7 +412,7 @@
                 <w:b w:val="false"/>
                 <w:bCs w:val="false"/>
               </w:rPr>
-              <w:t xml:space="preserve">________________________________________</w:t>
+              <w:t xml:space="preserve">DSY1106</w:t>
             </w:r>
           </w:p>
         </w:tc>
@@ -610,7 +610,7 @@
                 <w:b w:val="false"/>
                 <w:bCs w:val="false"/>
               </w:rPr>
-              <w:t xml:space="preserve">10 / 10 pruebas aprobadas (100 %)</w:t>
+              <w:t xml:space="preserve">77 / 77 pruebas aprobadas (100 %)</w:t>
             </w:r>
           </w:p>
         </w:tc>
@@ -722,7 +722,7 @@
         <w:jc w:val="both"/>
       </w:pPr>
       <w:r>
-        <w:t xml:space="preserve">El alcance de esta batería de pruebas cubre la lógica de dominio del microservicio de reservas (patrón Saga con compensación y control de capacidad bajo CQRS) y el contrato del orquestador de servicios (BFF) que el frontend consume mediante rutas de mismo origen. La siguiente tabla resume el entorno técnico utilizado.</w:t>
+        <w:t xml:space="preserve">El alcance cubre la lógica de negocio pura (cálculo de precios, proveedores de pago, geocodificación de regiones de Chile, limitación de peticiones), la lógica de dominio del microservicio de reservas (patrón Saga con compensación y control de capacidad bajo CQRS) y el contrato del orquestador de servicios (BFF). La siguiente tabla resume el entorno técnico.</w:t>
       </w:r>
     </w:p>
     <w:tbl>
@@ -904,7 +904,7 @@
                 <w:b/>
                 <w:bCs/>
               </w:rPr>
-              <w:t xml:space="preserve">Pruebas de integración (BFF)</w:t>
+              <w:t xml:space="preserve">Pruebas unitarias y de dominio</w:t>
             </w:r>
           </w:p>
         </w:tc>
@@ -936,7 +936,7 @@
                 <w:b w:val="false"/>
                 <w:bCs w:val="false"/>
               </w:rPr>
-              <w:t xml:space="preserve">node:test — runner de pruebas nativo de Node.js</w:t>
+              <w:t xml:space="preserve">Jest (babel-jest para módulos ESM)</w:t>
             </w:r>
           </w:p>
         </w:tc>
@@ -970,7 +970,7 @@
                 <w:b/>
                 <w:bCs/>
               </w:rPr>
-              <w:t xml:space="preserve">Pruebas unitarias y de dominio</w:t>
+              <w:t xml:space="preserve">Pruebas de integración (BFF)</w:t>
             </w:r>
           </w:p>
         </w:tc>
@@ -1002,7 +1002,7 @@
                 <w:b w:val="false"/>
                 <w:bCs w:val="false"/>
               </w:rPr>
-              <w:t xml:space="preserve">Jest (babel-jest para módulos ESM)</w:t>
+              <w:t xml:space="preserve">node:test — runner de pruebas nativo de Node.js</w:t>
             </w:r>
           </w:p>
         </w:tc>
@@ -1221,7 +1221,7 @@
         <w:jc w:val="both"/>
       </w:pPr>
       <w:r>
-        <w:t xml:space="preserve">Se aplicó una estrategia mixta que combina pruebas unitarias de dominio con pruebas de integración del contrato de las interfaces. Cada tipo de prueba valida una preocupación distinta del sistema:</w:t>
+        <w:t xml:space="preserve">Se aplicó una estrategia que combina pruebas unitarias de funciones puras de negocio, pruebas de dominio y pruebas de integración del contrato de las interfaces. Cada tipo valida una preocupación distinta del sistema:</w:t>
       </w:r>
     </w:p>
     <w:tbl>
@@ -1337,7 +1337,7 @@
                 <w:bCs/>
                 <w:color w:val="FFFFFF"/>
               </w:rPr>
-              <w:t xml:space="preserve">Suite</w:t>
+              <w:t xml:space="preserve">Suites</w:t>
             </w:r>
           </w:p>
         </w:tc>
@@ -1371,7 +1371,7 @@
                 <w:b/>
                 <w:bCs/>
               </w:rPr>
-              <w:t xml:space="preserve">Integración de API (BFF)</w:t>
+              <w:t xml:space="preserve">Unitarias (negocio)</w:t>
             </w:r>
           </w:p>
         </w:tc>
@@ -1403,7 +1403,7 @@
                 <w:b w:val="false"/>
                 <w:bCs w:val="false"/>
               </w:rPr>
-              <w:t xml:space="preserve">Contrato de las rutas del orquestador: estructura de respuesta y manejo de éxito y error</w:t>
+              <w:t xml:space="preserve">Funciones puras: precios, pagos, regiones, rate limit</w:t>
             </w:r>
           </w:p>
         </w:tc>
@@ -1432,11 +1432,11 @@
             </w:pPr>
             <w:r>
               <w:rPr>
-                <w:sz w:val="18"/>
-                <w:szCs w:val="18"/>
+                <w:sz w:val="16"/>
+                <w:szCs w:val="16"/>
                 <w:rFonts w:ascii="Consolas" w:cs="Consolas" w:eastAsia="Consolas" w:hAnsi="Consolas"/>
               </w:rPr>
-              <w:t xml:space="preserve">api.test.js</w:t>
+              <w:t xml:space="preserve">pricing · payments · geocoding · rateLimit</w:t>
             </w:r>
           </w:p>
         </w:tc>
@@ -1502,7 +1502,7 @@
                 <w:b w:val="false"/>
                 <w:bCs w:val="false"/>
               </w:rPr>
-              <w:t xml:space="preserve">Reserva atómica con compensación (rollback) y control de capacidad (CQRS)</w:t>
+              <w:t xml:space="preserve">Reserva atómica con compensación (rollback) y capacidad (CQRS)</w:t>
             </w:r>
           </w:p>
         </w:tc>
@@ -1531,8 +1531,8 @@
             </w:pPr>
             <w:r>
               <w:rPr>
-                <w:sz w:val="18"/>
-                <w:szCs w:val="18"/>
+                <w:sz w:val="16"/>
+                <w:szCs w:val="16"/>
                 <w:rFonts w:ascii="Consolas" w:cs="Consolas" w:eastAsia="Consolas" w:hAnsi="Consolas"/>
               </w:rPr>
               <w:t xml:space="preserve">reserveService.test.js</w:t>
@@ -1569,6 +1569,105 @@
                 <w:b/>
                 <w:bCs/>
               </w:rPr>
+              <w:t xml:space="preserve">Integración de API (BFF)</w:t>
+            </w:r>
+          </w:p>
+        </w:tc>
+        <w:tc>
+          <w:tcPr>
+            <w:tcW w:type="dxa" w:w="4372"/>
+            <w:tcBorders>
+              <w:top w:val="single" w:color="BFBFBF" w:sz="4"/>
+              <w:left w:val="single" w:color="BFBFBF" w:sz="4"/>
+              <w:bottom w:val="single" w:color="BFBFBF" w:sz="4"/>
+              <w:right w:val="single" w:color="BFBFBF" w:sz="4"/>
+            </w:tcBorders>
+            <w:shd w:fill="FFFFFF" w:val="clear"/>
+            <w:tcMar>
+              <w:top w:type="dxa" w:w="60"/>
+              <w:left w:type="dxa" w:w="110"/>
+              <w:bottom w:type="dxa" w:w="60"/>
+              <w:right w:type="dxa" w:w="110"/>
+            </w:tcMar>
+            <w:vAlign w:val="center"/>
+          </w:tcPr>
+          <w:p>
+            <w:pPr>
+              <w:spacing w:line="252" w:lineRule="auto" w:after="0"/>
+              <w:jc w:val="left"/>
+            </w:pPr>
+            <w:r>
+              <w:rPr>
+                <w:b w:val="false"/>
+                <w:bCs w:val="false"/>
+              </w:rPr>
+              <w:t xml:space="preserve">Contrato de las rutas del orquestador (estructura y errores)</w:t>
+            </w:r>
+          </w:p>
+        </w:tc>
+        <w:tc>
+          <w:tcPr>
+            <w:tcW w:type="dxa" w:w="2400"/>
+            <w:tcBorders>
+              <w:top w:val="single" w:color="BFBFBF" w:sz="4"/>
+              <w:left w:val="single" w:color="BFBFBF" w:sz="4"/>
+              <w:bottom w:val="single" w:color="BFBFBF" w:sz="4"/>
+              <w:right w:val="single" w:color="BFBFBF" w:sz="4"/>
+            </w:tcBorders>
+            <w:shd w:fill="FFFFFF" w:val="clear"/>
+            <w:tcMar>
+              <w:top w:type="dxa" w:w="60"/>
+              <w:left w:type="dxa" w:w="110"/>
+              <w:bottom w:type="dxa" w:w="60"/>
+              <w:right w:type="dxa" w:w="110"/>
+            </w:tcMar>
+            <w:vAlign w:val="center"/>
+          </w:tcPr>
+          <w:p>
+            <w:pPr>
+              <w:spacing w:line="252" w:lineRule="auto" w:after="0"/>
+              <w:jc w:val="left"/>
+            </w:pPr>
+            <w:r>
+              <w:rPr>
+                <w:sz w:val="16"/>
+                <w:szCs w:val="16"/>
+                <w:rFonts w:ascii="Consolas" w:cs="Consolas" w:eastAsia="Consolas" w:hAnsi="Consolas"/>
+              </w:rPr>
+              <w:t xml:space="preserve">api.test.js</w:t>
+            </w:r>
+          </w:p>
+        </w:tc>
+      </w:tr>
+      <w:tr>
+        <w:tc>
+          <w:tcPr>
+            <w:tcW w:type="dxa" w:w="2300"/>
+            <w:tcBorders>
+              <w:top w:val="single" w:color="BFBFBF" w:sz="4"/>
+              <w:left w:val="single" w:color="BFBFBF" w:sz="4"/>
+              <w:bottom w:val="single" w:color="BFBFBF" w:sz="4"/>
+              <w:right w:val="single" w:color="BFBFBF" w:sz="4"/>
+            </w:tcBorders>
+            <w:shd w:fill="F2F2F2" w:val="clear"/>
+            <w:tcMar>
+              <w:top w:type="dxa" w:w="60"/>
+              <w:left w:type="dxa" w:w="110"/>
+              <w:bottom w:type="dxa" w:w="60"/>
+              <w:right w:type="dxa" w:w="110"/>
+            </w:tcMar>
+            <w:vAlign w:val="center"/>
+          </w:tcPr>
+          <w:p>
+            <w:pPr>
+              <w:spacing w:line="252" w:lineRule="auto" w:after="0"/>
+              <w:jc w:val="left"/>
+            </w:pPr>
+            <w:r>
+              <w:rPr>
+                <w:b/>
+                <w:bCs/>
+              </w:rPr>
               <w:t xml:space="preserve">Resiliencia</w:t>
             </w:r>
           </w:p>
@@ -1582,26 +1681,26 @@
               <w:bottom w:val="single" w:color="BFBFBF" w:sz="4"/>
               <w:right w:val="single" w:color="BFBFBF" w:sz="4"/>
             </w:tcBorders>
-            <w:shd w:fill="FFFFFF" w:val="clear"/>
-            <w:tcMar>
-              <w:top w:type="dxa" w:w="60"/>
-              <w:left w:type="dxa" w:w="110"/>
-              <w:bottom w:type="dxa" w:w="60"/>
-              <w:right w:type="dxa" w:w="110"/>
-            </w:tcMar>
-            <w:vAlign w:val="center"/>
-          </w:tcPr>
-          <w:p>
-            <w:pPr>
-              <w:spacing w:line="252" w:lineRule="auto" w:after="0"/>
-              <w:jc w:val="left"/>
-            </w:pPr>
-            <w:r>
-              <w:rPr>
-                <w:b w:val="false"/>
-                <w:bCs w:val="false"/>
-              </w:rPr>
-              <w:t xml:space="preserve">Timeout estricto y respuesta de respaldo (fallback) del BFF ante latencia del backend</w:t>
+            <w:shd w:fill="F2F2F2" w:val="clear"/>
+            <w:tcMar>
+              <w:top w:type="dxa" w:w="60"/>
+              <w:left w:type="dxa" w:w="110"/>
+              <w:bottom w:type="dxa" w:w="60"/>
+              <w:right w:type="dxa" w:w="110"/>
+            </w:tcMar>
+            <w:vAlign w:val="center"/>
+          </w:tcPr>
+          <w:p>
+            <w:pPr>
+              <w:spacing w:line="252" w:lineRule="auto" w:after="0"/>
+              <w:jc w:val="left"/>
+            </w:pPr>
+            <w:r>
+              <w:rPr>
+                <w:b w:val="false"/>
+                <w:bCs w:val="false"/>
+              </w:rPr>
+              <w:t xml:space="preserve">Timeout estricto y respuesta de respaldo (fallback) del BFF</w:t>
             </w:r>
           </w:p>
         </w:tc>
@@ -1614,24 +1713,24 @@
               <w:bottom w:val="single" w:color="BFBFBF" w:sz="4"/>
               <w:right w:val="single" w:color="BFBFBF" w:sz="4"/>
             </w:tcBorders>
-            <w:shd w:fill="FFFFFF" w:val="clear"/>
-            <w:tcMar>
-              <w:top w:type="dxa" w:w="60"/>
-              <w:left w:type="dxa" w:w="110"/>
-              <w:bottom w:type="dxa" w:w="60"/>
-              <w:right w:type="dxa" w:w="110"/>
-            </w:tcMar>
-            <w:vAlign w:val="center"/>
-          </w:tcPr>
-          <w:p>
-            <w:pPr>
-              <w:spacing w:line="252" w:lineRule="auto" w:after="0"/>
-              <w:jc w:val="left"/>
-            </w:pPr>
-            <w:r>
-              <w:rPr>
-                <w:sz w:val="18"/>
-                <w:szCs w:val="18"/>
+            <w:shd w:fill="F2F2F2" w:val="clear"/>
+            <w:tcMar>
+              <w:top w:type="dxa" w:w="60"/>
+              <w:left w:type="dxa" w:w="110"/>
+              <w:bottom w:type="dxa" w:w="60"/>
+              <w:right w:type="dxa" w:w="110"/>
+            </w:tcMar>
+            <w:vAlign w:val="center"/>
+          </w:tcPr>
+          <w:p>
+            <w:pPr>
+              <w:spacing w:line="252" w:lineRule="auto" w:after="0"/>
+              <w:jc w:val="left"/>
+            </w:pPr>
+            <w:r>
+              <w:rPr>
+                <w:sz w:val="16"/>
+                <w:szCs w:val="16"/>
                 <w:rFonts w:ascii="Consolas" w:cs="Consolas" w:eastAsia="Consolas" w:hAnsi="Consolas"/>
               </w:rPr>
               <w:t xml:space="preserve">api.timeout.test.js</w:t>
@@ -1655,7 +1754,7 @@
         <w:jc w:val="both"/>
       </w:pPr>
       <w:r>
-        <w:t xml:space="preserve">Se ejecutaron 10 pruebas automatizadas distribuidas en 3 suites. La totalidad de las pruebas resultó aprobada, en un tiempo de ejecución inferior a un segundo y sin dependencias externas.</w:t>
+        <w:t xml:space="preserve">Se ejecutaron 77 pruebas automatizadas distribuidas en 7 suites. La totalidad resultó aprobada, en un tiempo de ejecución de pocos segundos y sin dependencias externas.</w:t>
       </w:r>
     </w:p>
     <w:tbl>
@@ -1840,7 +1939,7 @@
                 <w:szCs w:val="18"/>
                 <w:rFonts w:ascii="Consolas" w:cs="Consolas" w:eastAsia="Consolas" w:hAnsi="Consolas"/>
               </w:rPr>
-              <w:t xml:space="preserve">api.test.js</w:t>
+              <w:t xml:space="preserve">pricing.test.js</w:t>
             </w:r>
           </w:p>
         </w:tc>
@@ -1872,7 +1971,7 @@
                 <w:b w:val="false"/>
                 <w:bCs w:val="false"/>
               </w:rPr>
-              <w:t xml:space="preserve">node:test</w:t>
+              <w:t xml:space="preserve">Jest</w:t>
             </w:r>
           </w:p>
         </w:tc>
@@ -1904,7 +2003,7 @@
                 <w:b w:val="false"/>
                 <w:bCs w:val="false"/>
               </w:rPr>
-              <w:t xml:space="preserve">6</w:t>
+              <w:t xml:space="preserve">24</w:t>
             </w:r>
           </w:p>
         </w:tc>
@@ -1936,7 +2035,7 @@
                 <w:b w:val="false"/>
                 <w:bCs w:val="false"/>
               </w:rPr>
-              <w:t xml:space="preserve">6 / 6 aprobadas</w:t>
+              <w:t xml:space="preserve">24 / 24 aprobadas</w:t>
             </w:r>
           </w:p>
         </w:tc>
@@ -1971,7 +2070,7 @@
                 <w:szCs w:val="18"/>
                 <w:rFonts w:ascii="Consolas" w:cs="Consolas" w:eastAsia="Consolas" w:hAnsi="Consolas"/>
               </w:rPr>
-              <w:t xml:space="preserve">api.timeout.test.js</w:t>
+              <w:t xml:space="preserve">payments.test.js</w:t>
             </w:r>
           </w:p>
         </w:tc>
@@ -2035,7 +2134,7 @@
                 <w:b w:val="false"/>
                 <w:bCs w:val="false"/>
               </w:rPr>
-              <w:t xml:space="preserve">2</w:t>
+              <w:t xml:space="preserve">30</w:t>
             </w:r>
           </w:p>
         </w:tc>
@@ -2067,7 +2166,7 @@
                 <w:b w:val="false"/>
                 <w:bCs w:val="false"/>
               </w:rPr>
-              <w:t xml:space="preserve">2 / 2 aprobadas</w:t>
+              <w:t xml:space="preserve">30 / 30 aprobadas</w:t>
             </w:r>
           </w:p>
         </w:tc>
@@ -2102,7 +2201,7 @@
                 <w:szCs w:val="18"/>
                 <w:rFonts w:ascii="Consolas" w:cs="Consolas" w:eastAsia="Consolas" w:hAnsi="Consolas"/>
               </w:rPr>
-              <w:t xml:space="preserve">reserveService.test.js</w:t>
+              <w:t xml:space="preserve">geocoding.test.js</w:t>
             </w:r>
           </w:p>
         </w:tc>
@@ -2166,7 +2265,7 @@
                 <w:b w:val="false"/>
                 <w:bCs w:val="false"/>
               </w:rPr>
-              <w:t xml:space="preserve">2</w:t>
+              <w:t xml:space="preserve">8</w:t>
             </w:r>
           </w:p>
         </w:tc>
@@ -2198,7 +2297,7 @@
                 <w:b w:val="false"/>
                 <w:bCs w:val="false"/>
               </w:rPr>
-              <w:t xml:space="preserve">2 / 2 aprobadas</w:t>
+              <w:t xml:space="preserve">8 / 8 aprobadas</w:t>
             </w:r>
           </w:p>
         </w:tc>
@@ -2213,6 +2312,530 @@
               <w:bottom w:val="single" w:color="BFBFBF" w:sz="4"/>
               <w:right w:val="single" w:color="BFBFBF" w:sz="4"/>
             </w:tcBorders>
+            <w:shd w:fill="F2F2F2" w:val="clear"/>
+            <w:tcMar>
+              <w:top w:type="dxa" w:w="60"/>
+              <w:left w:type="dxa" w:w="110"/>
+              <w:bottom w:type="dxa" w:w="60"/>
+              <w:right w:type="dxa" w:w="110"/>
+            </w:tcMar>
+            <w:vAlign w:val="center"/>
+          </w:tcPr>
+          <w:p>
+            <w:pPr>
+              <w:spacing w:line="252" w:lineRule="auto" w:after="0"/>
+              <w:jc w:val="left"/>
+            </w:pPr>
+            <w:r>
+              <w:rPr>
+                <w:sz w:val="18"/>
+                <w:szCs w:val="18"/>
+                <w:rFonts w:ascii="Consolas" w:cs="Consolas" w:eastAsia="Consolas" w:hAnsi="Consolas"/>
+              </w:rPr>
+              <w:t xml:space="preserve">rateLimit.test.js</w:t>
+            </w:r>
+          </w:p>
+        </w:tc>
+        <w:tc>
+          <w:tcPr>
+            <w:tcW w:type="dxa" w:w="1900"/>
+            <w:tcBorders>
+              <w:top w:val="single" w:color="BFBFBF" w:sz="4"/>
+              <w:left w:val="single" w:color="BFBFBF" w:sz="4"/>
+              <w:bottom w:val="single" w:color="BFBFBF" w:sz="4"/>
+              <w:right w:val="single" w:color="BFBFBF" w:sz="4"/>
+            </w:tcBorders>
+            <w:shd w:fill="F2F2F2" w:val="clear"/>
+            <w:tcMar>
+              <w:top w:type="dxa" w:w="60"/>
+              <w:left w:type="dxa" w:w="110"/>
+              <w:bottom w:type="dxa" w:w="60"/>
+              <w:right w:type="dxa" w:w="110"/>
+            </w:tcMar>
+            <w:vAlign w:val="center"/>
+          </w:tcPr>
+          <w:p>
+            <w:pPr>
+              <w:spacing w:line="252" w:lineRule="auto" w:after="0"/>
+              <w:jc w:val="left"/>
+            </w:pPr>
+            <w:r>
+              <w:rPr>
+                <w:b w:val="false"/>
+                <w:bCs w:val="false"/>
+              </w:rPr>
+              <w:t xml:space="preserve">Jest</w:t>
+            </w:r>
+          </w:p>
+        </w:tc>
+        <w:tc>
+          <w:tcPr>
+            <w:tcW w:type="dxa" w:w="1300"/>
+            <w:tcBorders>
+              <w:top w:val="single" w:color="BFBFBF" w:sz="4"/>
+              <w:left w:val="single" w:color="BFBFBF" w:sz="4"/>
+              <w:bottom w:val="single" w:color="BFBFBF" w:sz="4"/>
+              <w:right w:val="single" w:color="BFBFBF" w:sz="4"/>
+            </w:tcBorders>
+            <w:shd w:fill="F2F2F2" w:val="clear"/>
+            <w:tcMar>
+              <w:top w:type="dxa" w:w="60"/>
+              <w:left w:type="dxa" w:w="110"/>
+              <w:bottom w:type="dxa" w:w="60"/>
+              <w:right w:type="dxa" w:w="110"/>
+            </w:tcMar>
+            <w:vAlign w:val="center"/>
+          </w:tcPr>
+          <w:p>
+            <w:pPr>
+              <w:spacing w:line="252" w:lineRule="auto" w:after="0"/>
+              <w:jc w:val="center"/>
+            </w:pPr>
+            <w:r>
+              <w:rPr>
+                <w:b w:val="false"/>
+                <w:bCs w:val="false"/>
+              </w:rPr>
+              <w:t xml:space="preserve">5</w:t>
+            </w:r>
+          </w:p>
+        </w:tc>
+        <w:tc>
+          <w:tcPr>
+            <w:tcW w:type="dxa" w:w="2500"/>
+            <w:tcBorders>
+              <w:top w:val="single" w:color="BFBFBF" w:sz="4"/>
+              <w:left w:val="single" w:color="BFBFBF" w:sz="4"/>
+              <w:bottom w:val="single" w:color="BFBFBF" w:sz="4"/>
+              <w:right w:val="single" w:color="BFBFBF" w:sz="4"/>
+            </w:tcBorders>
+            <w:shd w:fill="F2F2F2" w:val="clear"/>
+            <w:tcMar>
+              <w:top w:type="dxa" w:w="60"/>
+              <w:left w:type="dxa" w:w="110"/>
+              <w:bottom w:type="dxa" w:w="60"/>
+              <w:right w:type="dxa" w:w="110"/>
+            </w:tcMar>
+            <w:vAlign w:val="center"/>
+          </w:tcPr>
+          <w:p>
+            <w:pPr>
+              <w:spacing w:line="252" w:lineRule="auto" w:after="0"/>
+              <w:jc w:val="center"/>
+            </w:pPr>
+            <w:r>
+              <w:rPr>
+                <w:b w:val="false"/>
+                <w:bCs w:val="false"/>
+              </w:rPr>
+              <w:t xml:space="preserve">5 / 5 aprobadas</w:t>
+            </w:r>
+          </w:p>
+        </w:tc>
+      </w:tr>
+      <w:tr>
+        <w:tc>
+          <w:tcPr>
+            <w:tcW w:type="dxa" w:w="3372"/>
+            <w:tcBorders>
+              <w:top w:val="single" w:color="BFBFBF" w:sz="4"/>
+              <w:left w:val="single" w:color="BFBFBF" w:sz="4"/>
+              <w:bottom w:val="single" w:color="BFBFBF" w:sz="4"/>
+              <w:right w:val="single" w:color="BFBFBF" w:sz="4"/>
+            </w:tcBorders>
+            <w:shd w:fill="FFFFFF" w:val="clear"/>
+            <w:tcMar>
+              <w:top w:type="dxa" w:w="60"/>
+              <w:left w:type="dxa" w:w="110"/>
+              <w:bottom w:type="dxa" w:w="60"/>
+              <w:right w:type="dxa" w:w="110"/>
+            </w:tcMar>
+            <w:vAlign w:val="center"/>
+          </w:tcPr>
+          <w:p>
+            <w:pPr>
+              <w:spacing w:line="252" w:lineRule="auto" w:after="0"/>
+              <w:jc w:val="left"/>
+            </w:pPr>
+            <w:r>
+              <w:rPr>
+                <w:sz w:val="18"/>
+                <w:szCs w:val="18"/>
+                <w:rFonts w:ascii="Consolas" w:cs="Consolas" w:eastAsia="Consolas" w:hAnsi="Consolas"/>
+              </w:rPr>
+              <w:t xml:space="preserve">reserveService.test.js</w:t>
+            </w:r>
+          </w:p>
+        </w:tc>
+        <w:tc>
+          <w:tcPr>
+            <w:tcW w:type="dxa" w:w="1900"/>
+            <w:tcBorders>
+              <w:top w:val="single" w:color="BFBFBF" w:sz="4"/>
+              <w:left w:val="single" w:color="BFBFBF" w:sz="4"/>
+              <w:bottom w:val="single" w:color="BFBFBF" w:sz="4"/>
+              <w:right w:val="single" w:color="BFBFBF" w:sz="4"/>
+            </w:tcBorders>
+            <w:shd w:fill="FFFFFF" w:val="clear"/>
+            <w:tcMar>
+              <w:top w:type="dxa" w:w="60"/>
+              <w:left w:type="dxa" w:w="110"/>
+              <w:bottom w:type="dxa" w:w="60"/>
+              <w:right w:type="dxa" w:w="110"/>
+            </w:tcMar>
+            <w:vAlign w:val="center"/>
+          </w:tcPr>
+          <w:p>
+            <w:pPr>
+              <w:spacing w:line="252" w:lineRule="auto" w:after="0"/>
+              <w:jc w:val="left"/>
+            </w:pPr>
+            <w:r>
+              <w:rPr>
+                <w:b w:val="false"/>
+                <w:bCs w:val="false"/>
+              </w:rPr>
+              <w:t xml:space="preserve">Jest</w:t>
+            </w:r>
+          </w:p>
+        </w:tc>
+        <w:tc>
+          <w:tcPr>
+            <w:tcW w:type="dxa" w:w="1300"/>
+            <w:tcBorders>
+              <w:top w:val="single" w:color="BFBFBF" w:sz="4"/>
+              <w:left w:val="single" w:color="BFBFBF" w:sz="4"/>
+              <w:bottom w:val="single" w:color="BFBFBF" w:sz="4"/>
+              <w:right w:val="single" w:color="BFBFBF" w:sz="4"/>
+            </w:tcBorders>
+            <w:shd w:fill="FFFFFF" w:val="clear"/>
+            <w:tcMar>
+              <w:top w:type="dxa" w:w="60"/>
+              <w:left w:type="dxa" w:w="110"/>
+              <w:bottom w:type="dxa" w:w="60"/>
+              <w:right w:type="dxa" w:w="110"/>
+            </w:tcMar>
+            <w:vAlign w:val="center"/>
+          </w:tcPr>
+          <w:p>
+            <w:pPr>
+              <w:spacing w:line="252" w:lineRule="auto" w:after="0"/>
+              <w:jc w:val="center"/>
+            </w:pPr>
+            <w:r>
+              <w:rPr>
+                <w:b w:val="false"/>
+                <w:bCs w:val="false"/>
+              </w:rPr>
+              <w:t xml:space="preserve">2</w:t>
+            </w:r>
+          </w:p>
+        </w:tc>
+        <w:tc>
+          <w:tcPr>
+            <w:tcW w:type="dxa" w:w="2500"/>
+            <w:tcBorders>
+              <w:top w:val="single" w:color="BFBFBF" w:sz="4"/>
+              <w:left w:val="single" w:color="BFBFBF" w:sz="4"/>
+              <w:bottom w:val="single" w:color="BFBFBF" w:sz="4"/>
+              <w:right w:val="single" w:color="BFBFBF" w:sz="4"/>
+            </w:tcBorders>
+            <w:shd w:fill="FFFFFF" w:val="clear"/>
+            <w:tcMar>
+              <w:top w:type="dxa" w:w="60"/>
+              <w:left w:type="dxa" w:w="110"/>
+              <w:bottom w:type="dxa" w:w="60"/>
+              <w:right w:type="dxa" w:w="110"/>
+            </w:tcMar>
+            <w:vAlign w:val="center"/>
+          </w:tcPr>
+          <w:p>
+            <w:pPr>
+              <w:spacing w:line="252" w:lineRule="auto" w:after="0"/>
+              <w:jc w:val="center"/>
+            </w:pPr>
+            <w:r>
+              <w:rPr>
+                <w:b w:val="false"/>
+                <w:bCs w:val="false"/>
+              </w:rPr>
+              <w:t xml:space="preserve">2 / 2 aprobadas</w:t>
+            </w:r>
+          </w:p>
+        </w:tc>
+      </w:tr>
+      <w:tr>
+        <w:tc>
+          <w:tcPr>
+            <w:tcW w:type="dxa" w:w="3372"/>
+            <w:tcBorders>
+              <w:top w:val="single" w:color="BFBFBF" w:sz="4"/>
+              <w:left w:val="single" w:color="BFBFBF" w:sz="4"/>
+              <w:bottom w:val="single" w:color="BFBFBF" w:sz="4"/>
+              <w:right w:val="single" w:color="BFBFBF" w:sz="4"/>
+            </w:tcBorders>
+            <w:shd w:fill="F2F2F2" w:val="clear"/>
+            <w:tcMar>
+              <w:top w:type="dxa" w:w="60"/>
+              <w:left w:type="dxa" w:w="110"/>
+              <w:bottom w:type="dxa" w:w="60"/>
+              <w:right w:type="dxa" w:w="110"/>
+            </w:tcMar>
+            <w:vAlign w:val="center"/>
+          </w:tcPr>
+          <w:p>
+            <w:pPr>
+              <w:spacing w:line="252" w:lineRule="auto" w:after="0"/>
+              <w:jc w:val="left"/>
+            </w:pPr>
+            <w:r>
+              <w:rPr>
+                <w:sz w:val="18"/>
+                <w:szCs w:val="18"/>
+                <w:rFonts w:ascii="Consolas" w:cs="Consolas" w:eastAsia="Consolas" w:hAnsi="Consolas"/>
+              </w:rPr>
+              <w:t xml:space="preserve">api.timeout.test.js</w:t>
+            </w:r>
+          </w:p>
+        </w:tc>
+        <w:tc>
+          <w:tcPr>
+            <w:tcW w:type="dxa" w:w="1900"/>
+            <w:tcBorders>
+              <w:top w:val="single" w:color="BFBFBF" w:sz="4"/>
+              <w:left w:val="single" w:color="BFBFBF" w:sz="4"/>
+              <w:bottom w:val="single" w:color="BFBFBF" w:sz="4"/>
+              <w:right w:val="single" w:color="BFBFBF" w:sz="4"/>
+            </w:tcBorders>
+            <w:shd w:fill="F2F2F2" w:val="clear"/>
+            <w:tcMar>
+              <w:top w:type="dxa" w:w="60"/>
+              <w:left w:type="dxa" w:w="110"/>
+              <w:bottom w:type="dxa" w:w="60"/>
+              <w:right w:type="dxa" w:w="110"/>
+            </w:tcMar>
+            <w:vAlign w:val="center"/>
+          </w:tcPr>
+          <w:p>
+            <w:pPr>
+              <w:spacing w:line="252" w:lineRule="auto" w:after="0"/>
+              <w:jc w:val="left"/>
+            </w:pPr>
+            <w:r>
+              <w:rPr>
+                <w:b w:val="false"/>
+                <w:bCs w:val="false"/>
+              </w:rPr>
+              <w:t xml:space="preserve">Jest</w:t>
+            </w:r>
+          </w:p>
+        </w:tc>
+        <w:tc>
+          <w:tcPr>
+            <w:tcW w:type="dxa" w:w="1300"/>
+            <w:tcBorders>
+              <w:top w:val="single" w:color="BFBFBF" w:sz="4"/>
+              <w:left w:val="single" w:color="BFBFBF" w:sz="4"/>
+              <w:bottom w:val="single" w:color="BFBFBF" w:sz="4"/>
+              <w:right w:val="single" w:color="BFBFBF" w:sz="4"/>
+            </w:tcBorders>
+            <w:shd w:fill="F2F2F2" w:val="clear"/>
+            <w:tcMar>
+              <w:top w:type="dxa" w:w="60"/>
+              <w:left w:type="dxa" w:w="110"/>
+              <w:bottom w:type="dxa" w:w="60"/>
+              <w:right w:type="dxa" w:w="110"/>
+            </w:tcMar>
+            <w:vAlign w:val="center"/>
+          </w:tcPr>
+          <w:p>
+            <w:pPr>
+              <w:spacing w:line="252" w:lineRule="auto" w:after="0"/>
+              <w:jc w:val="center"/>
+            </w:pPr>
+            <w:r>
+              <w:rPr>
+                <w:b w:val="false"/>
+                <w:bCs w:val="false"/>
+              </w:rPr>
+              <w:t xml:space="preserve">2</w:t>
+            </w:r>
+          </w:p>
+        </w:tc>
+        <w:tc>
+          <w:tcPr>
+            <w:tcW w:type="dxa" w:w="2500"/>
+            <w:tcBorders>
+              <w:top w:val="single" w:color="BFBFBF" w:sz="4"/>
+              <w:left w:val="single" w:color="BFBFBF" w:sz="4"/>
+              <w:bottom w:val="single" w:color="BFBFBF" w:sz="4"/>
+              <w:right w:val="single" w:color="BFBFBF" w:sz="4"/>
+            </w:tcBorders>
+            <w:shd w:fill="F2F2F2" w:val="clear"/>
+            <w:tcMar>
+              <w:top w:type="dxa" w:w="60"/>
+              <w:left w:type="dxa" w:w="110"/>
+              <w:bottom w:type="dxa" w:w="60"/>
+              <w:right w:type="dxa" w:w="110"/>
+            </w:tcMar>
+            <w:vAlign w:val="center"/>
+          </w:tcPr>
+          <w:p>
+            <w:pPr>
+              <w:spacing w:line="252" w:lineRule="auto" w:after="0"/>
+              <w:jc w:val="center"/>
+            </w:pPr>
+            <w:r>
+              <w:rPr>
+                <w:b w:val="false"/>
+                <w:bCs w:val="false"/>
+              </w:rPr>
+              <w:t xml:space="preserve">2 / 2 aprobadas</w:t>
+            </w:r>
+          </w:p>
+        </w:tc>
+      </w:tr>
+      <w:tr>
+        <w:tc>
+          <w:tcPr>
+            <w:tcW w:type="dxa" w:w="3372"/>
+            <w:tcBorders>
+              <w:top w:val="single" w:color="BFBFBF" w:sz="4"/>
+              <w:left w:val="single" w:color="BFBFBF" w:sz="4"/>
+              <w:bottom w:val="single" w:color="BFBFBF" w:sz="4"/>
+              <w:right w:val="single" w:color="BFBFBF" w:sz="4"/>
+            </w:tcBorders>
+            <w:shd w:fill="FFFFFF" w:val="clear"/>
+            <w:tcMar>
+              <w:top w:type="dxa" w:w="60"/>
+              <w:left w:type="dxa" w:w="110"/>
+              <w:bottom w:type="dxa" w:w="60"/>
+              <w:right w:type="dxa" w:w="110"/>
+            </w:tcMar>
+            <w:vAlign w:val="center"/>
+          </w:tcPr>
+          <w:p>
+            <w:pPr>
+              <w:spacing w:line="252" w:lineRule="auto" w:after="0"/>
+              <w:jc w:val="left"/>
+            </w:pPr>
+            <w:r>
+              <w:rPr>
+                <w:sz w:val="18"/>
+                <w:szCs w:val="18"/>
+                <w:rFonts w:ascii="Consolas" w:cs="Consolas" w:eastAsia="Consolas" w:hAnsi="Consolas"/>
+              </w:rPr>
+              <w:t xml:space="preserve">api.test.js (BFF)</w:t>
+            </w:r>
+          </w:p>
+        </w:tc>
+        <w:tc>
+          <w:tcPr>
+            <w:tcW w:type="dxa" w:w="1900"/>
+            <w:tcBorders>
+              <w:top w:val="single" w:color="BFBFBF" w:sz="4"/>
+              <w:left w:val="single" w:color="BFBFBF" w:sz="4"/>
+              <w:bottom w:val="single" w:color="BFBFBF" w:sz="4"/>
+              <w:right w:val="single" w:color="BFBFBF" w:sz="4"/>
+            </w:tcBorders>
+            <w:shd w:fill="FFFFFF" w:val="clear"/>
+            <w:tcMar>
+              <w:top w:type="dxa" w:w="60"/>
+              <w:left w:type="dxa" w:w="110"/>
+              <w:bottom w:type="dxa" w:w="60"/>
+              <w:right w:type="dxa" w:w="110"/>
+            </w:tcMar>
+            <w:vAlign w:val="center"/>
+          </w:tcPr>
+          <w:p>
+            <w:pPr>
+              <w:spacing w:line="252" w:lineRule="auto" w:after="0"/>
+              <w:jc w:val="left"/>
+            </w:pPr>
+            <w:r>
+              <w:rPr>
+                <w:b w:val="false"/>
+                <w:bCs w:val="false"/>
+              </w:rPr>
+              <w:t xml:space="preserve">node:test</w:t>
+            </w:r>
+          </w:p>
+        </w:tc>
+        <w:tc>
+          <w:tcPr>
+            <w:tcW w:type="dxa" w:w="1300"/>
+            <w:tcBorders>
+              <w:top w:val="single" w:color="BFBFBF" w:sz="4"/>
+              <w:left w:val="single" w:color="BFBFBF" w:sz="4"/>
+              <w:bottom w:val="single" w:color="BFBFBF" w:sz="4"/>
+              <w:right w:val="single" w:color="BFBFBF" w:sz="4"/>
+            </w:tcBorders>
+            <w:shd w:fill="FFFFFF" w:val="clear"/>
+            <w:tcMar>
+              <w:top w:type="dxa" w:w="60"/>
+              <w:left w:type="dxa" w:w="110"/>
+              <w:bottom w:type="dxa" w:w="60"/>
+              <w:right w:type="dxa" w:w="110"/>
+            </w:tcMar>
+            <w:vAlign w:val="center"/>
+          </w:tcPr>
+          <w:p>
+            <w:pPr>
+              <w:spacing w:line="252" w:lineRule="auto" w:after="0"/>
+              <w:jc w:val="center"/>
+            </w:pPr>
+            <w:r>
+              <w:rPr>
+                <w:b w:val="false"/>
+                <w:bCs w:val="false"/>
+              </w:rPr>
+              <w:t xml:space="preserve">6</w:t>
+            </w:r>
+          </w:p>
+        </w:tc>
+        <w:tc>
+          <w:tcPr>
+            <w:tcW w:type="dxa" w:w="2500"/>
+            <w:tcBorders>
+              <w:top w:val="single" w:color="BFBFBF" w:sz="4"/>
+              <w:left w:val="single" w:color="BFBFBF" w:sz="4"/>
+              <w:bottom w:val="single" w:color="BFBFBF" w:sz="4"/>
+              <w:right w:val="single" w:color="BFBFBF" w:sz="4"/>
+            </w:tcBorders>
+            <w:shd w:fill="FFFFFF" w:val="clear"/>
+            <w:tcMar>
+              <w:top w:type="dxa" w:w="60"/>
+              <w:left w:type="dxa" w:w="110"/>
+              <w:bottom w:type="dxa" w:w="60"/>
+              <w:right w:type="dxa" w:w="110"/>
+            </w:tcMar>
+            <w:vAlign w:val="center"/>
+          </w:tcPr>
+          <w:p>
+            <w:pPr>
+              <w:spacing w:line="252" w:lineRule="auto" w:after="0"/>
+              <w:jc w:val="center"/>
+            </w:pPr>
+            <w:r>
+              <w:rPr>
+                <w:b w:val="false"/>
+                <w:bCs w:val="false"/>
+              </w:rPr>
+              <w:t xml:space="preserve">6 / 6 aprobadas</w:t>
+            </w:r>
+          </w:p>
+        </w:tc>
+      </w:tr>
+      <w:tr>
+        <w:tc>
+          <w:tcPr>
+            <w:tcW w:type="dxa" w:w="3372"/>
+            <w:tcBorders>
+              <w:top w:val="single" w:color="BFBFBF" w:sz="4"/>
+              <w:left w:val="single" w:color="BFBFBF" w:sz="4"/>
+              <w:bottom w:val="single" w:color="BFBFBF" w:sz="4"/>
+              <w:right w:val="single" w:color="BFBFBF" w:sz="4"/>
+            </w:tcBorders>
             <w:shd w:fill="D6E4F0" w:val="clear"/>
             <w:tcMar>
               <w:top w:type="dxa" w:w="60"/>
@@ -2296,7 +2919,7 @@
                 <w:b/>
                 <w:bCs/>
               </w:rPr>
-              <w:t xml:space="preserve">10</w:t>
+              <w:t xml:space="preserve">77</w:t>
             </w:r>
           </w:p>
         </w:tc>
@@ -2328,7 +2951,7 @@
                 <w:b/>
                 <w:bCs/>
               </w:rPr>
-              <w:t xml:space="preserve">10 / 10 (100 %)</w:t>
+              <w:t xml:space="preserve">77 / 77 (100 %)</w:t>
             </w:r>
           </w:p>
         </w:tc>
@@ -2336,6 +2959,15 @@
     </w:tbl>
     <w:p>
       <w:pPr>
+        <w:spacing w:line="360" w:lineRule="auto" w:after="120"/>
+        <w:jc w:val="both"/>
+      </w:pPr>
+      <w:r>
+        <w:t xml:space="preserve">Las pruebas Jest cubren 71 casos en 6 suites; la suite de integración del BFF (api.test.js) aporta 6 casos adicionales mediante el runner nativo node:test.</w:t>
+      </w:r>
+    </w:p>
+    <w:p>
+      <w:pPr>
         <w:pStyle w:val="Heading1"/>
         <w:spacing w:before="320" w:after="160" w:line="276" w:lineRule="auto"/>
       </w:pPr>
@@ -2349,7 +2981,139 @@
         <w:spacing w:before="220" w:after="120" w:line="276" w:lineRule="auto"/>
       </w:pPr>
       <w:r>
-        <w:t xml:space="preserve">5.1. api.test.js — Contratos del BFF (node:test)</w:t>
+        <w:t xml:space="preserve">5.1. pricing.test.js — Cálculo de precios (24 casos)</w:t>
+      </w:r>
+    </w:p>
+    <w:p>
+      <w:pPr>
+        <w:spacing w:line="360" w:lineRule="auto" w:after="120"/>
+        <w:jc w:val="both"/>
+      </w:pPr>
+      <w:r>
+        <w:rPr>
+          <w:b/>
+          <w:bCs/>
+        </w:rPr>
+        <w:t xml:space="preserve">Módulo: </w:t>
+      </w:r>
+      <w:r>
+        <w:rPr>
+          <w:sz w:val="20"/>
+          <w:szCs w:val="20"/>
+          <w:rFonts w:ascii="Consolas" w:cs="Consolas" w:eastAsia="Consolas" w:hAnsi="Consolas"/>
+        </w:rPr>
+        <w:t xml:space="preserve">apps/web/src/lib/pricing.js</w:t>
+      </w:r>
+      <w:r>
+        <w:t xml:space="preserve"> (calcTotal, calcBreakdown). Valida el cálculo de tarifa por duración: duración 0 → $0; estacionamiento gratuito → $0; tarifas por hora, por minuto y por día (incluyendo redondeos y fracciones); combinaciones día+hora+minuto; y que el desglose (calcBreakdown) sume exactamente lo mismo que calcTotal.</w:t>
+      </w:r>
+    </w:p>
+    <w:p>
+      <w:pPr>
+        <w:pStyle w:val="Heading2"/>
+        <w:spacing w:before="220" w:after="120" w:line="276" w:lineRule="auto"/>
+      </w:pPr>
+      <w:r>
+        <w:t xml:space="preserve">5.2. payments.test.js — Proveedores de pago, patrón Strategy (30 casos)</w:t>
+      </w:r>
+    </w:p>
+    <w:p>
+      <w:pPr>
+        <w:spacing w:line="360" w:lineRule="auto" w:after="120"/>
+        <w:jc w:val="both"/>
+      </w:pPr>
+      <w:r>
+        <w:rPr>
+          <w:b/>
+          <w:bCs/>
+        </w:rPr>
+        <w:t xml:space="preserve">Módulo: </w:t>
+      </w:r>
+      <w:r>
+        <w:rPr>
+          <w:sz w:val="20"/>
+          <w:szCs w:val="20"/>
+          <w:rFonts w:ascii="Consolas" w:cs="Consolas" w:eastAsia="Consolas" w:hAnsi="Consolas"/>
+        </w:rPr>
+        <w:t xml:space="preserve">apps/web/src/lib/payments.js</w:t>
+      </w:r>
+      <w:r>
+        <w:t xml:space="preserve">. Valida isValidProvider (acepta mock/efectivo/webpay y rechaza otros), genTransactionId (formato, prefijo y unicidad), isWebpayConfigured, y que createCharge devuelva un contrato uniforme { status, transactionId, raw } para los distintos proveedores.</w:t>
+      </w:r>
+    </w:p>
+    <w:p>
+      <w:pPr>
+        <w:pStyle w:val="Heading2"/>
+        <w:spacing w:before="220" w:after="120" w:line="276" w:lineRule="auto"/>
+      </w:pPr>
+      <w:r>
+        <w:t xml:space="preserve">5.3. geocoding.test.js — Regiones de Chile (8 casos)</w:t>
+      </w:r>
+    </w:p>
+    <w:p>
+      <w:pPr>
+        <w:spacing w:line="360" w:lineRule="auto" w:after="120"/>
+        <w:jc w:val="both"/>
+      </w:pPr>
+      <w:r>
+        <w:rPr>
+          <w:b/>
+          <w:bCs/>
+        </w:rPr>
+        <w:t xml:space="preserve">Módulo: </w:t>
+      </w:r>
+      <w:r>
+        <w:rPr>
+          <w:sz w:val="20"/>
+          <w:szCs w:val="20"/>
+          <w:rFonts w:ascii="Consolas" w:cs="Consolas" w:eastAsia="Consolas" w:hAnsi="Consolas"/>
+        </w:rPr>
+        <w:t xml:space="preserve">apps/web/src/lib/comunas-chile.js</w:t>
+      </w:r>
+      <w:r>
+        <w:t xml:space="preserve"> (REGIONES, detectarRegion). Valida que existan las 16 regiones con sus campos y límites coherentes, que coordenadas reales caigan en la región correcta (Santiago → Región Metropolitana, Valparaíso → V Región) y que puntos fuera de Chile devuelvan null.</w:t>
+      </w:r>
+    </w:p>
+    <w:p>
+      <w:pPr>
+        <w:pStyle w:val="Heading2"/>
+        <w:spacing w:before="220" w:after="120" w:line="276" w:lineRule="auto"/>
+      </w:pPr>
+      <w:r>
+        <w:t xml:space="preserve">5.4. rateLimit.test.js — Limitación de peticiones (5 casos)</w:t>
+      </w:r>
+    </w:p>
+    <w:p>
+      <w:pPr>
+        <w:spacing w:line="360" w:lineRule="auto" w:after="120"/>
+        <w:jc w:val="both"/>
+      </w:pPr>
+      <w:r>
+        <w:rPr>
+          <w:b/>
+          <w:bCs/>
+        </w:rPr>
+        <w:t xml:space="preserve">Módulo: </w:t>
+      </w:r>
+      <w:r>
+        <w:rPr>
+          <w:sz w:val="20"/>
+          <w:szCs w:val="20"/>
+          <w:rFonts w:ascii="Consolas" w:cs="Consolas" w:eastAsia="Consolas" w:hAnsi="Consolas"/>
+        </w:rPr>
+        <w:t xml:space="preserve">apps/web/src/lib/rateLimit.js</w:t>
+      </w:r>
+      <w:r>
+        <w:t xml:space="preserve">. Valida el limitador de tasa: permite hasta el máximo de accesos y bloquea el siguiente, mantiene contadores independientes por clave y decrementa el remanente en cada acceso; además, clientIp extrae correctamente la IP del cliente desde la cabecera x-forwarded-for.</w:t>
+      </w:r>
+    </w:p>
+    <w:p>
+      <w:pPr>
+        <w:pStyle w:val="Heading2"/>
+        <w:spacing w:before="220" w:after="120" w:line="276" w:lineRule="auto"/>
+      </w:pPr>
+      <w:r>
+        <w:t xml:space="preserve">5.5. api.test.js — Contratos del BFF (node:test, 6 casos)</w:t>
       </w:r>
     </w:p>
     <w:p>
@@ -2380,7 +3144,7 @@
         <w:t xml:space="preserve">/api/reservas/reserve</w:t>
       </w:r>
       <w:r>
-        <w:t xml:space="preserve"> utilizando un mock de fetch, sin base de datos real. Verifica tanto los caminos de éxito como el manejo de errores del orquestador (BFF). Casos cubiertos:</w:t>
+        <w:t xml:space="preserve"> con un mock de fetch, sin base de datos real. Casos cubiertos:</w:t>
       </w:r>
     </w:p>
     <w:tbl>
@@ -3096,7 +3860,7 @@
         <w:spacing w:before="220" w:after="120" w:line="276" w:lineRule="auto"/>
       </w:pPr>
       <w:r>
-        <w:t xml:space="preserve">5.2. reserveService.test.js — Saga de reservas (Jest)</w:t>
+        <w:t xml:space="preserve">5.6. reserveService.test.js — Saga de reservas (2 casos)</w:t>
       </w:r>
     </w:p>
     <w:p>
@@ -3117,10 +3881,10 @@
           <w:szCs w:val="20"/>
           <w:rFonts w:ascii="Consolas" w:cs="Consolas" w:eastAsia="Consolas" w:hAnsi="Consolas"/>
         </w:rPr>
-        <w:t xml:space="preserve">apps/ms-reservas/app/api/v1/reserve/services/reserva.service.js</w:t>
-      </w:r>
-      <w:r>
-        <w:t xml:space="preserve">. Demuestra la robustez transaccional del dominio de reservas mediante el patrón Saga con compensación:</w:t>
+        <w:t xml:space="preserve">apps/ms-reservas/.../services/reserva.service.js</w:t>
+      </w:r>
+      <w:r>
+        <w:t xml:space="preserve">. Demuestra la robustez transaccional mediante el patrón Saga con compensación:</w:t>
       </w:r>
     </w:p>
     <w:p>
@@ -3141,7 +3905,7 @@
         <w:t xml:space="preserve">Control de capacidad (CQRS): </w:t>
       </w:r>
       <w:r>
-        <w:t xml:space="preserve">rechaza la reserva si el estacionamiento ya está lleno y, en ese caso, no llega a crear la reserva.</w:t>
+        <w:t xml:space="preserve">rechaza la reserva si el estacionamiento está lleno y, en ese caso, no llega a crear la reserva.</w:t>
       </w:r>
     </w:p>
     <w:p>
@@ -3162,7 +3926,7 @@
         <w:t xml:space="preserve">Compensación (rollback): </w:t>
       </w:r>
       <w:r>
-        <w:t xml:space="preserve">si la operación de aumento de ocupación falla (simulando un error de concurrencia), la Saga revierte la reserva ya creada, garantizando la integridad de los datos («Saga Compensada»).</w:t>
+        <w:t xml:space="preserve">si falla el aumento de ocupación (error de concurrencia), la Saga revierte la reserva creada, garantizando la integridad de los datos.</w:t>
       </w:r>
     </w:p>
     <w:p>
@@ -3171,7 +3935,7 @@
         <w:spacing w:before="220" w:after="120" w:line="276" w:lineRule="auto"/>
       </w:pPr>
       <w:r>
-        <w:t xml:space="preserve">5.3. api.timeout.test.js — Resiliencia del BFF (Jest)</w:t>
+        <w:t xml:space="preserve">5.7. api.timeout.test.js — Resiliencia del BFF (2 casos)</w:t>
       </w:r>
     </w:p>
     <w:p>
@@ -3195,14 +3959,14 @@
       </w:r>
       <w:r>
         <w:rPr>
-          <w:sz w:val="18"/>
-          <w:szCs w:val="18"/>
+          <w:sz w:val="16"/>
+          <w:szCs w:val="16"/>
           <w:rFonts w:ascii="Consolas" w:cs="Consolas" w:eastAsia="Consolas" w:hAnsi="Consolas"/>
         </w:rPr>
         <w:t xml:space="preserve">{ success: false, error: true, fallback: true, data: [] }</w:t>
       </w:r>
       <w:r>
-        <w:t xml:space="preserve">) cuando la petición supera el límite estricto de 8 segundos. De este modo se demuestra el manejo controlado de la latencia o indisponibilidad del backend.</w:t>
+        <w:t xml:space="preserve">) cuando se supera el límite estricto de 8 segundos.</w:t>
       </w:r>
     </w:p>
     <w:p>
@@ -3220,7 +3984,7 @@
         <w:jc w:val="both"/>
       </w:pPr>
       <w:r>
-        <w:t xml:space="preserve">La siguiente tabla presenta la cobertura de los módulos ejercitados por las suites Jest, generada con Istanbul. Cabe destacar que las ramas (branches) del servicio de reservas —donde reside la lógica crítica de la Saga— se encuentran cubiertas al 100 %.</w:t>
+        <w:t xml:space="preserve">La siguiente tabla presenta la cobertura global del código probado, generada con Istanbul (npx jest --coverage). La lógica de negocio pura alcanza una cobertura muy alta, y las ramas (branches) del servicio de reservas —donde reside la Saga— están cubiertas al 100 %.</w:t>
       </w:r>
     </w:p>
     <w:tbl>
@@ -3236,16 +4000,16 @@
         </w:tblBorders>
       </w:tblPr>
       <w:tblGrid>
-        <w:gridCol w:w="3072"/>
-        <w:gridCol w:w="1500"/>
-        <w:gridCol w:w="1500"/>
-        <w:gridCol w:w="1500"/>
-        <w:gridCol w:w="1500"/>
+        <w:gridCol w:w="2772"/>
+        <w:gridCol w:w="1575"/>
+        <w:gridCol w:w="1575"/>
+        <w:gridCol w:w="1575"/>
+        <w:gridCol w:w="1575"/>
       </w:tblGrid>
       <w:tr>
         <w:tc>
           <w:tcPr>
-            <w:tcW w:type="dxa" w:w="3072"/>
+            <w:tcW w:type="dxa" w:w="2772"/>
             <w:tcBorders>
               <w:top w:val="single" w:color="BFBFBF" w:sz="4"/>
               <w:left w:val="single" w:color="BFBFBF" w:sz="4"/>
@@ -3278,7 +4042,7 @@
         </w:tc>
         <w:tc>
           <w:tcPr>
-            <w:tcW w:type="dxa" w:w="1500"/>
+            <w:tcW w:type="dxa" w:w="1575"/>
             <w:tcBorders>
               <w:top w:val="single" w:color="BFBFBF" w:sz="4"/>
               <w:left w:val="single" w:color="BFBFBF" w:sz="4"/>
@@ -3311,7 +4075,7 @@
         </w:tc>
         <w:tc>
           <w:tcPr>
-            <w:tcW w:type="dxa" w:w="1500"/>
+            <w:tcW w:type="dxa" w:w="1575"/>
             <w:tcBorders>
               <w:top w:val="single" w:color="BFBFBF" w:sz="4"/>
               <w:left w:val="single" w:color="BFBFBF" w:sz="4"/>
@@ -3344,7 +4108,7 @@
         </w:tc>
         <w:tc>
           <w:tcPr>
-            <w:tcW w:type="dxa" w:w="1500"/>
+            <w:tcW w:type="dxa" w:w="1575"/>
             <w:tcBorders>
               <w:top w:val="single" w:color="BFBFBF" w:sz="4"/>
               <w:left w:val="single" w:color="BFBFBF" w:sz="4"/>
@@ -3377,7 +4141,7 @@
         </w:tc>
         <w:tc>
           <w:tcPr>
-            <w:tcW w:type="dxa" w:w="1500"/>
+            <w:tcW w:type="dxa" w:w="1575"/>
             <w:tcBorders>
               <w:top w:val="single" w:color="BFBFBF" w:sz="4"/>
               <w:left w:val="single" w:color="BFBFBF" w:sz="4"/>
@@ -3412,7 +4176,7 @@
       <w:tr>
         <w:tc>
           <w:tcPr>
-            <w:tcW w:type="dxa" w:w="3072"/>
+            <w:tcW w:type="dxa" w:w="2772"/>
             <w:tcBorders>
               <w:top w:val="single" w:color="BFBFBF" w:sz="4"/>
               <w:left w:val="single" w:color="BFBFBF" w:sz="4"/>
@@ -3447,7 +4211,7 @@
         </w:tc>
         <w:tc>
           <w:tcPr>
-            <w:tcW w:type="dxa" w:w="1500"/>
+            <w:tcW w:type="dxa" w:w="1575"/>
             <w:tcBorders>
               <w:top w:val="single" w:color="BFBFBF" w:sz="4"/>
               <w:left w:val="single" w:color="BFBFBF" w:sz="4"/>
@@ -3473,13 +4237,13 @@
                 <w:b/>
                 <w:bCs/>
               </w:rPr>
-              <w:t xml:space="preserve">62.71</w:t>
-            </w:r>
-          </w:p>
-        </w:tc>
-        <w:tc>
-          <w:tcPr>
-            <w:tcW w:type="dxa" w:w="1500"/>
+              <w:t xml:space="preserve">73.15</w:t>
+            </w:r>
+          </w:p>
+        </w:tc>
+        <w:tc>
+          <w:tcPr>
+            <w:tcW w:type="dxa" w:w="1575"/>
             <w:tcBorders>
               <w:top w:val="single" w:color="BFBFBF" w:sz="4"/>
               <w:left w:val="single" w:color="BFBFBF" w:sz="4"/>
@@ -3505,13 +4269,13 @@
                 <w:b/>
                 <w:bCs/>
               </w:rPr>
-              <w:t xml:space="preserve">47.36</w:t>
-            </w:r>
-          </w:p>
-        </w:tc>
-        <w:tc>
-          <w:tcPr>
-            <w:tcW w:type="dxa" w:w="1500"/>
+              <w:t xml:space="preserve">70.43</w:t>
+            </w:r>
+          </w:p>
+        </w:tc>
+        <w:tc>
+          <w:tcPr>
+            <w:tcW w:type="dxa" w:w="1575"/>
             <w:tcBorders>
               <w:top w:val="single" w:color="BFBFBF" w:sz="4"/>
               <w:left w:val="single" w:color="BFBFBF" w:sz="4"/>
@@ -3537,13 +4301,13 @@
                 <w:b/>
                 <w:bCs/>
               </w:rPr>
-              <w:t xml:space="preserve">30.76</w:t>
-            </w:r>
-          </w:p>
-        </w:tc>
-        <w:tc>
-          <w:tcPr>
-            <w:tcW w:type="dxa" w:w="1500"/>
+              <w:t xml:space="preserve">41.46</w:t>
+            </w:r>
+          </w:p>
+        </w:tc>
+        <w:tc>
+          <w:tcPr>
+            <w:tcW w:type="dxa" w:w="1575"/>
             <w:tcBorders>
               <w:top w:val="single" w:color="BFBFBF" w:sz="4"/>
               <w:left w:val="single" w:color="BFBFBF" w:sz="4"/>
@@ -3569,7 +4333,7 @@
                 <w:b/>
                 <w:bCs/>
               </w:rPr>
-              <w:t xml:space="preserve">62.50</w:t>
+              <w:t xml:space="preserve">72.85</w:t>
             </w:r>
           </w:p>
         </w:tc>
@@ -3577,7 +4341,7 @@
       <w:tr>
         <w:tc>
           <w:tcPr>
-            <w:tcW w:type="dxa" w:w="3072"/>
+            <w:tcW w:type="dxa" w:w="2772"/>
             <w:tcBorders>
               <w:top w:val="single" w:color="BFBFBF" w:sz="4"/>
               <w:left w:val="single" w:color="BFBFBF" w:sz="4"/>
@@ -3606,13 +4370,13 @@
                 <w:szCs w:val="18"/>
                 <w:rFonts w:ascii="Consolas" w:cs="Consolas" w:eastAsia="Consolas" w:hAnsi="Consolas"/>
               </w:rPr>
-              <w:t xml:space="preserve">reserva.service.js</w:t>
-            </w:r>
-          </w:p>
-        </w:tc>
-        <w:tc>
-          <w:tcPr>
-            <w:tcW w:type="dxa" w:w="1500"/>
+              <w:t xml:space="preserve">pricing.js</w:t>
+            </w:r>
+          </w:p>
+        </w:tc>
+        <w:tc>
+          <w:tcPr>
+            <w:tcW w:type="dxa" w:w="1575"/>
             <w:tcBorders>
               <w:top w:val="single" w:color="BFBFBF" w:sz="4"/>
               <w:left w:val="single" w:color="BFBFBF" w:sz="4"/>
@@ -3638,13 +4402,13 @@
                 <w:b w:val="false"/>
                 <w:bCs w:val="false"/>
               </w:rPr>
-              <w:t xml:space="preserve">78.57</w:t>
-            </w:r>
-          </w:p>
-        </w:tc>
-        <w:tc>
-          <w:tcPr>
-            <w:tcW w:type="dxa" w:w="1500"/>
+              <w:t xml:space="preserve">100</w:t>
+            </w:r>
+          </w:p>
+        </w:tc>
+        <w:tc>
+          <w:tcPr>
+            <w:tcW w:type="dxa" w:w="1575"/>
             <w:tcBorders>
               <w:top w:val="single" w:color="BFBFBF" w:sz="4"/>
               <w:left w:val="single" w:color="BFBFBF" w:sz="4"/>
@@ -3670,13 +4434,45 @@
                 <w:b w:val="false"/>
                 <w:bCs w:val="false"/>
               </w:rPr>
+              <w:t xml:space="preserve">97.5</w:t>
+            </w:r>
+          </w:p>
+        </w:tc>
+        <w:tc>
+          <w:tcPr>
+            <w:tcW w:type="dxa" w:w="1575"/>
+            <w:tcBorders>
+              <w:top w:val="single" w:color="BFBFBF" w:sz="4"/>
+              <w:left w:val="single" w:color="BFBFBF" w:sz="4"/>
+              <w:bottom w:val="single" w:color="BFBFBF" w:sz="4"/>
+              <w:right w:val="single" w:color="BFBFBF" w:sz="4"/>
+            </w:tcBorders>
+            <w:shd w:fill="FFFFFF" w:val="clear"/>
+            <w:tcMar>
+              <w:top w:type="dxa" w:w="60"/>
+              <w:left w:type="dxa" w:w="110"/>
+              <w:bottom w:type="dxa" w:w="60"/>
+              <w:right w:type="dxa" w:w="110"/>
+            </w:tcMar>
+            <w:vAlign w:val="center"/>
+          </w:tcPr>
+          <w:p>
+            <w:pPr>
+              <w:spacing w:line="252" w:lineRule="auto" w:after="0"/>
+              <w:jc w:val="center"/>
+            </w:pPr>
+            <w:r>
+              <w:rPr>
+                <w:b w:val="false"/>
+                <w:bCs w:val="false"/>
+              </w:rPr>
               <w:t xml:space="preserve">100</w:t>
             </w:r>
           </w:p>
         </w:tc>
         <w:tc>
           <w:tcPr>
-            <w:tcW w:type="dxa" w:w="1500"/>
+            <w:tcW w:type="dxa" w:w="1575"/>
             <w:tcBorders>
               <w:top w:val="single" w:color="BFBFBF" w:sz="4"/>
               <w:left w:val="single" w:color="BFBFBF" w:sz="4"/>
@@ -3702,39 +4498,7 @@
                 <w:b w:val="false"/>
                 <w:bCs w:val="false"/>
               </w:rPr>
-              <w:t xml:space="preserve">50</w:t>
-            </w:r>
-          </w:p>
-        </w:tc>
-        <w:tc>
-          <w:tcPr>
-            <w:tcW w:type="dxa" w:w="1500"/>
-            <w:tcBorders>
-              <w:top w:val="single" w:color="BFBFBF" w:sz="4"/>
-              <w:left w:val="single" w:color="BFBFBF" w:sz="4"/>
-              <w:bottom w:val="single" w:color="BFBFBF" w:sz="4"/>
-              <w:right w:val="single" w:color="BFBFBF" w:sz="4"/>
-            </w:tcBorders>
-            <w:shd w:fill="FFFFFF" w:val="clear"/>
-            <w:tcMar>
-              <w:top w:type="dxa" w:w="60"/>
-              <w:left w:type="dxa" w:w="110"/>
-              <w:bottom w:type="dxa" w:w="60"/>
-              <w:right w:type="dxa" w:w="110"/>
-            </w:tcMar>
-            <w:vAlign w:val="center"/>
-          </w:tcPr>
-          <w:p>
-            <w:pPr>
-              <w:spacing w:line="252" w:lineRule="auto" w:after="0"/>
-              <w:jc w:val="center"/>
-            </w:pPr>
-            <w:r>
-              <w:rPr>
-                <w:b w:val="false"/>
-                <w:bCs w:val="false"/>
-              </w:rPr>
-              <w:t xml:space="preserve">78.57</w:t>
+              <w:t xml:space="preserve">100</w:t>
             </w:r>
           </w:p>
         </w:tc>
@@ -3742,7 +4506,7 @@
       <w:tr>
         <w:tc>
           <w:tcPr>
-            <w:tcW w:type="dxa" w:w="3072"/>
+            <w:tcW w:type="dxa" w:w="2772"/>
             <w:tcBorders>
               <w:top w:val="single" w:color="BFBFBF" w:sz="4"/>
               <w:left w:val="single" w:color="BFBFBF" w:sz="4"/>
@@ -3771,13 +4535,673 @@
                 <w:szCs w:val="18"/>
                 <w:rFonts w:ascii="Consolas" w:cs="Consolas" w:eastAsia="Consolas" w:hAnsi="Consolas"/>
               </w:rPr>
+              <w:t xml:space="preserve">payments.js</w:t>
+            </w:r>
+          </w:p>
+        </w:tc>
+        <w:tc>
+          <w:tcPr>
+            <w:tcW w:type="dxa" w:w="1575"/>
+            <w:tcBorders>
+              <w:top w:val="single" w:color="BFBFBF" w:sz="4"/>
+              <w:left w:val="single" w:color="BFBFBF" w:sz="4"/>
+              <w:bottom w:val="single" w:color="BFBFBF" w:sz="4"/>
+              <w:right w:val="single" w:color="BFBFBF" w:sz="4"/>
+            </w:tcBorders>
+            <w:shd w:fill="FFFFFF" w:val="clear"/>
+            <w:tcMar>
+              <w:top w:type="dxa" w:w="60"/>
+              <w:left w:type="dxa" w:w="110"/>
+              <w:bottom w:type="dxa" w:w="60"/>
+              <w:right w:type="dxa" w:w="110"/>
+            </w:tcMar>
+            <w:vAlign w:val="center"/>
+          </w:tcPr>
+          <w:p>
+            <w:pPr>
+              <w:spacing w:line="252" w:lineRule="auto" w:after="0"/>
+              <w:jc w:val="center"/>
+            </w:pPr>
+            <w:r>
+              <w:rPr>
+                <w:b w:val="false"/>
+                <w:bCs w:val="false"/>
+              </w:rPr>
+              <w:t xml:space="preserve">92.30</w:t>
+            </w:r>
+          </w:p>
+        </w:tc>
+        <w:tc>
+          <w:tcPr>
+            <w:tcW w:type="dxa" w:w="1575"/>
+            <w:tcBorders>
+              <w:top w:val="single" w:color="BFBFBF" w:sz="4"/>
+              <w:left w:val="single" w:color="BFBFBF" w:sz="4"/>
+              <w:bottom w:val="single" w:color="BFBFBF" w:sz="4"/>
+              <w:right w:val="single" w:color="BFBFBF" w:sz="4"/>
+            </w:tcBorders>
+            <w:shd w:fill="FFFFFF" w:val="clear"/>
+            <w:tcMar>
+              <w:top w:type="dxa" w:w="60"/>
+              <w:left w:type="dxa" w:w="110"/>
+              <w:bottom w:type="dxa" w:w="60"/>
+              <w:right w:type="dxa" w:w="110"/>
+            </w:tcMar>
+            <w:vAlign w:val="center"/>
+          </w:tcPr>
+          <w:p>
+            <w:pPr>
+              <w:spacing w:line="252" w:lineRule="auto" w:after="0"/>
+              <w:jc w:val="center"/>
+            </w:pPr>
+            <w:r>
+              <w:rPr>
+                <w:b w:val="false"/>
+                <w:bCs w:val="false"/>
+              </w:rPr>
+              <w:t xml:space="preserve">80</w:t>
+            </w:r>
+          </w:p>
+        </w:tc>
+        <w:tc>
+          <w:tcPr>
+            <w:tcW w:type="dxa" w:w="1575"/>
+            <w:tcBorders>
+              <w:top w:val="single" w:color="BFBFBF" w:sz="4"/>
+              <w:left w:val="single" w:color="BFBFBF" w:sz="4"/>
+              <w:bottom w:val="single" w:color="BFBFBF" w:sz="4"/>
+              <w:right w:val="single" w:color="BFBFBF" w:sz="4"/>
+            </w:tcBorders>
+            <w:shd w:fill="FFFFFF" w:val="clear"/>
+            <w:tcMar>
+              <w:top w:type="dxa" w:w="60"/>
+              <w:left w:type="dxa" w:w="110"/>
+              <w:bottom w:type="dxa" w:w="60"/>
+              <w:right w:type="dxa" w:w="110"/>
+            </w:tcMar>
+            <w:vAlign w:val="center"/>
+          </w:tcPr>
+          <w:p>
+            <w:pPr>
+              <w:spacing w:line="252" w:lineRule="auto" w:after="0"/>
+              <w:jc w:val="center"/>
+            </w:pPr>
+            <w:r>
+              <w:rPr>
+                <w:b w:val="false"/>
+                <w:bCs w:val="false"/>
+              </w:rPr>
+              <w:t xml:space="preserve">100</w:t>
+            </w:r>
+          </w:p>
+        </w:tc>
+        <w:tc>
+          <w:tcPr>
+            <w:tcW w:type="dxa" w:w="1575"/>
+            <w:tcBorders>
+              <w:top w:val="single" w:color="BFBFBF" w:sz="4"/>
+              <w:left w:val="single" w:color="BFBFBF" w:sz="4"/>
+              <w:bottom w:val="single" w:color="BFBFBF" w:sz="4"/>
+              <w:right w:val="single" w:color="BFBFBF" w:sz="4"/>
+            </w:tcBorders>
+            <w:shd w:fill="FFFFFF" w:val="clear"/>
+            <w:tcMar>
+              <w:top w:type="dxa" w:w="60"/>
+              <w:left w:type="dxa" w:w="110"/>
+              <w:bottom w:type="dxa" w:w="60"/>
+              <w:right w:type="dxa" w:w="110"/>
+            </w:tcMar>
+            <w:vAlign w:val="center"/>
+          </w:tcPr>
+          <w:p>
+            <w:pPr>
+              <w:spacing w:line="252" w:lineRule="auto" w:after="0"/>
+              <w:jc w:val="center"/>
+            </w:pPr>
+            <w:r>
+              <w:rPr>
+                <w:b w:val="false"/>
+                <w:bCs w:val="false"/>
+              </w:rPr>
+              <w:t xml:space="preserve">92.30</w:t>
+            </w:r>
+          </w:p>
+        </w:tc>
+      </w:tr>
+      <w:tr>
+        <w:tc>
+          <w:tcPr>
+            <w:tcW w:type="dxa" w:w="2772"/>
+            <w:tcBorders>
+              <w:top w:val="single" w:color="BFBFBF" w:sz="4"/>
+              <w:left w:val="single" w:color="BFBFBF" w:sz="4"/>
+              <w:bottom w:val="single" w:color="BFBFBF" w:sz="4"/>
+              <w:right w:val="single" w:color="BFBFBF" w:sz="4"/>
+            </w:tcBorders>
+            <w:shd w:fill="FFFFFF" w:val="clear"/>
+            <w:tcMar>
+              <w:top w:type="dxa" w:w="60"/>
+              <w:left w:type="dxa" w:w="110"/>
+              <w:bottom w:type="dxa" w:w="60"/>
+              <w:right w:type="dxa" w:w="110"/>
+            </w:tcMar>
+            <w:vAlign w:val="center"/>
+          </w:tcPr>
+          <w:p>
+            <w:pPr>
+              <w:spacing w:line="252" w:lineRule="auto" w:after="0"/>
+              <w:jc w:val="left"/>
+            </w:pPr>
+            <w:r>
+              <w:rPr>
+                <w:b w:val="false"/>
+                <w:bCs w:val="false"/>
+                <w:sz w:val="18"/>
+                <w:szCs w:val="18"/>
+                <w:rFonts w:ascii="Consolas" w:cs="Consolas" w:eastAsia="Consolas" w:hAnsi="Consolas"/>
+              </w:rPr>
+              <w:t xml:space="preserve">comunas-chile.js</w:t>
+            </w:r>
+          </w:p>
+        </w:tc>
+        <w:tc>
+          <w:tcPr>
+            <w:tcW w:type="dxa" w:w="1575"/>
+            <w:tcBorders>
+              <w:top w:val="single" w:color="BFBFBF" w:sz="4"/>
+              <w:left w:val="single" w:color="BFBFBF" w:sz="4"/>
+              <w:bottom w:val="single" w:color="BFBFBF" w:sz="4"/>
+              <w:right w:val="single" w:color="BFBFBF" w:sz="4"/>
+            </w:tcBorders>
+            <w:shd w:fill="FFFFFF" w:val="clear"/>
+            <w:tcMar>
+              <w:top w:type="dxa" w:w="60"/>
+              <w:left w:type="dxa" w:w="110"/>
+              <w:bottom w:type="dxa" w:w="60"/>
+              <w:right w:type="dxa" w:w="110"/>
+            </w:tcMar>
+            <w:vAlign w:val="center"/>
+          </w:tcPr>
+          <w:p>
+            <w:pPr>
+              <w:spacing w:line="252" w:lineRule="auto" w:after="0"/>
+              <w:jc w:val="center"/>
+            </w:pPr>
+            <w:r>
+              <w:rPr>
+                <w:b w:val="false"/>
+                <w:bCs w:val="false"/>
+              </w:rPr>
+              <w:t xml:space="preserve">100</w:t>
+            </w:r>
+          </w:p>
+        </w:tc>
+        <w:tc>
+          <w:tcPr>
+            <w:tcW w:type="dxa" w:w="1575"/>
+            <w:tcBorders>
+              <w:top w:val="single" w:color="BFBFBF" w:sz="4"/>
+              <w:left w:val="single" w:color="BFBFBF" w:sz="4"/>
+              <w:bottom w:val="single" w:color="BFBFBF" w:sz="4"/>
+              <w:right w:val="single" w:color="BFBFBF" w:sz="4"/>
+            </w:tcBorders>
+            <w:shd w:fill="FFFFFF" w:val="clear"/>
+            <w:tcMar>
+              <w:top w:type="dxa" w:w="60"/>
+              <w:left w:type="dxa" w:w="110"/>
+              <w:bottom w:type="dxa" w:w="60"/>
+              <w:right w:type="dxa" w:w="110"/>
+            </w:tcMar>
+            <w:vAlign w:val="center"/>
+          </w:tcPr>
+          <w:p>
+            <w:pPr>
+              <w:spacing w:line="252" w:lineRule="auto" w:after="0"/>
+              <w:jc w:val="center"/>
+            </w:pPr>
+            <w:r>
+              <w:rPr>
+                <w:b w:val="false"/>
+                <w:bCs w:val="false"/>
+              </w:rPr>
+              <w:t xml:space="preserve">100</w:t>
+            </w:r>
+          </w:p>
+        </w:tc>
+        <w:tc>
+          <w:tcPr>
+            <w:tcW w:type="dxa" w:w="1575"/>
+            <w:tcBorders>
+              <w:top w:val="single" w:color="BFBFBF" w:sz="4"/>
+              <w:left w:val="single" w:color="BFBFBF" w:sz="4"/>
+              <w:bottom w:val="single" w:color="BFBFBF" w:sz="4"/>
+              <w:right w:val="single" w:color="BFBFBF" w:sz="4"/>
+            </w:tcBorders>
+            <w:shd w:fill="FFFFFF" w:val="clear"/>
+            <w:tcMar>
+              <w:top w:type="dxa" w:w="60"/>
+              <w:left w:type="dxa" w:w="110"/>
+              <w:bottom w:type="dxa" w:w="60"/>
+              <w:right w:type="dxa" w:w="110"/>
+            </w:tcMar>
+            <w:vAlign w:val="center"/>
+          </w:tcPr>
+          <w:p>
+            <w:pPr>
+              <w:spacing w:line="252" w:lineRule="auto" w:after="0"/>
+              <w:jc w:val="center"/>
+            </w:pPr>
+            <w:r>
+              <w:rPr>
+                <w:b w:val="false"/>
+                <w:bCs w:val="false"/>
+              </w:rPr>
+              <w:t xml:space="preserve">100</w:t>
+            </w:r>
+          </w:p>
+        </w:tc>
+        <w:tc>
+          <w:tcPr>
+            <w:tcW w:type="dxa" w:w="1575"/>
+            <w:tcBorders>
+              <w:top w:val="single" w:color="BFBFBF" w:sz="4"/>
+              <w:left w:val="single" w:color="BFBFBF" w:sz="4"/>
+              <w:bottom w:val="single" w:color="BFBFBF" w:sz="4"/>
+              <w:right w:val="single" w:color="BFBFBF" w:sz="4"/>
+            </w:tcBorders>
+            <w:shd w:fill="FFFFFF" w:val="clear"/>
+            <w:tcMar>
+              <w:top w:type="dxa" w:w="60"/>
+              <w:left w:type="dxa" w:w="110"/>
+              <w:bottom w:type="dxa" w:w="60"/>
+              <w:right w:type="dxa" w:w="110"/>
+            </w:tcMar>
+            <w:vAlign w:val="center"/>
+          </w:tcPr>
+          <w:p>
+            <w:pPr>
+              <w:spacing w:line="252" w:lineRule="auto" w:after="0"/>
+              <w:jc w:val="center"/>
+            </w:pPr>
+            <w:r>
+              <w:rPr>
+                <w:b w:val="false"/>
+                <w:bCs w:val="false"/>
+              </w:rPr>
+              <w:t xml:space="preserve">100</w:t>
+            </w:r>
+          </w:p>
+        </w:tc>
+      </w:tr>
+      <w:tr>
+        <w:tc>
+          <w:tcPr>
+            <w:tcW w:type="dxa" w:w="2772"/>
+            <w:tcBorders>
+              <w:top w:val="single" w:color="BFBFBF" w:sz="4"/>
+              <w:left w:val="single" w:color="BFBFBF" w:sz="4"/>
+              <w:bottom w:val="single" w:color="BFBFBF" w:sz="4"/>
+              <w:right w:val="single" w:color="BFBFBF" w:sz="4"/>
+            </w:tcBorders>
+            <w:shd w:fill="FFFFFF" w:val="clear"/>
+            <w:tcMar>
+              <w:top w:type="dxa" w:w="60"/>
+              <w:left w:type="dxa" w:w="110"/>
+              <w:bottom w:type="dxa" w:w="60"/>
+              <w:right w:type="dxa" w:w="110"/>
+            </w:tcMar>
+            <w:vAlign w:val="center"/>
+          </w:tcPr>
+          <w:p>
+            <w:pPr>
+              <w:spacing w:line="252" w:lineRule="auto" w:after="0"/>
+              <w:jc w:val="left"/>
+            </w:pPr>
+            <w:r>
+              <w:rPr>
+                <w:b w:val="false"/>
+                <w:bCs w:val="false"/>
+                <w:sz w:val="18"/>
+                <w:szCs w:val="18"/>
+                <w:rFonts w:ascii="Consolas" w:cs="Consolas" w:eastAsia="Consolas" w:hAnsi="Consolas"/>
+              </w:rPr>
+              <w:t xml:space="preserve">rateLimit.js</w:t>
+            </w:r>
+          </w:p>
+        </w:tc>
+        <w:tc>
+          <w:tcPr>
+            <w:tcW w:type="dxa" w:w="1575"/>
+            <w:tcBorders>
+              <w:top w:val="single" w:color="BFBFBF" w:sz="4"/>
+              <w:left w:val="single" w:color="BFBFBF" w:sz="4"/>
+              <w:bottom w:val="single" w:color="BFBFBF" w:sz="4"/>
+              <w:right w:val="single" w:color="BFBFBF" w:sz="4"/>
+            </w:tcBorders>
+            <w:shd w:fill="FFFFFF" w:val="clear"/>
+            <w:tcMar>
+              <w:top w:type="dxa" w:w="60"/>
+              <w:left w:type="dxa" w:w="110"/>
+              <w:bottom w:type="dxa" w:w="60"/>
+              <w:right w:type="dxa" w:w="110"/>
+            </w:tcMar>
+            <w:vAlign w:val="center"/>
+          </w:tcPr>
+          <w:p>
+            <w:pPr>
+              <w:spacing w:line="252" w:lineRule="auto" w:after="0"/>
+              <w:jc w:val="center"/>
+            </w:pPr>
+            <w:r>
+              <w:rPr>
+                <w:b w:val="false"/>
+                <w:bCs w:val="false"/>
+              </w:rPr>
+              <w:t xml:space="preserve">100</w:t>
+            </w:r>
+          </w:p>
+        </w:tc>
+        <w:tc>
+          <w:tcPr>
+            <w:tcW w:type="dxa" w:w="1575"/>
+            <w:tcBorders>
+              <w:top w:val="single" w:color="BFBFBF" w:sz="4"/>
+              <w:left w:val="single" w:color="BFBFBF" w:sz="4"/>
+              <w:bottom w:val="single" w:color="BFBFBF" w:sz="4"/>
+              <w:right w:val="single" w:color="BFBFBF" w:sz="4"/>
+            </w:tcBorders>
+            <w:shd w:fill="FFFFFF" w:val="clear"/>
+            <w:tcMar>
+              <w:top w:type="dxa" w:w="60"/>
+              <w:left w:type="dxa" w:w="110"/>
+              <w:bottom w:type="dxa" w:w="60"/>
+              <w:right w:type="dxa" w:w="110"/>
+            </w:tcMar>
+            <w:vAlign w:val="center"/>
+          </w:tcPr>
+          <w:p>
+            <w:pPr>
+              <w:spacing w:line="252" w:lineRule="auto" w:after="0"/>
+              <w:jc w:val="center"/>
+            </w:pPr>
+            <w:r>
+              <w:rPr>
+                <w:b w:val="false"/>
+                <w:bCs w:val="false"/>
+              </w:rPr>
+              <w:t xml:space="preserve">81.81</w:t>
+            </w:r>
+          </w:p>
+        </w:tc>
+        <w:tc>
+          <w:tcPr>
+            <w:tcW w:type="dxa" w:w="1575"/>
+            <w:tcBorders>
+              <w:top w:val="single" w:color="BFBFBF" w:sz="4"/>
+              <w:left w:val="single" w:color="BFBFBF" w:sz="4"/>
+              <w:bottom w:val="single" w:color="BFBFBF" w:sz="4"/>
+              <w:right w:val="single" w:color="BFBFBF" w:sz="4"/>
+            </w:tcBorders>
+            <w:shd w:fill="FFFFFF" w:val="clear"/>
+            <w:tcMar>
+              <w:top w:type="dxa" w:w="60"/>
+              <w:left w:type="dxa" w:w="110"/>
+              <w:bottom w:type="dxa" w:w="60"/>
+              <w:right w:type="dxa" w:w="110"/>
+            </w:tcMar>
+            <w:vAlign w:val="center"/>
+          </w:tcPr>
+          <w:p>
+            <w:pPr>
+              <w:spacing w:line="252" w:lineRule="auto" w:after="0"/>
+              <w:jc w:val="center"/>
+            </w:pPr>
+            <w:r>
+              <w:rPr>
+                <w:b w:val="false"/>
+                <w:bCs w:val="false"/>
+              </w:rPr>
+              <w:t xml:space="preserve">100</w:t>
+            </w:r>
+          </w:p>
+        </w:tc>
+        <w:tc>
+          <w:tcPr>
+            <w:tcW w:type="dxa" w:w="1575"/>
+            <w:tcBorders>
+              <w:top w:val="single" w:color="BFBFBF" w:sz="4"/>
+              <w:left w:val="single" w:color="BFBFBF" w:sz="4"/>
+              <w:bottom w:val="single" w:color="BFBFBF" w:sz="4"/>
+              <w:right w:val="single" w:color="BFBFBF" w:sz="4"/>
+            </w:tcBorders>
+            <w:shd w:fill="FFFFFF" w:val="clear"/>
+            <w:tcMar>
+              <w:top w:type="dxa" w:w="60"/>
+              <w:left w:type="dxa" w:w="110"/>
+              <w:bottom w:type="dxa" w:w="60"/>
+              <w:right w:type="dxa" w:w="110"/>
+            </w:tcMar>
+            <w:vAlign w:val="center"/>
+          </w:tcPr>
+          <w:p>
+            <w:pPr>
+              <w:spacing w:line="252" w:lineRule="auto" w:after="0"/>
+              <w:jc w:val="center"/>
+            </w:pPr>
+            <w:r>
+              <w:rPr>
+                <w:b w:val="false"/>
+                <w:bCs w:val="false"/>
+              </w:rPr>
+              <w:t xml:space="preserve">100</w:t>
+            </w:r>
+          </w:p>
+        </w:tc>
+      </w:tr>
+      <w:tr>
+        <w:tc>
+          <w:tcPr>
+            <w:tcW w:type="dxa" w:w="2772"/>
+            <w:tcBorders>
+              <w:top w:val="single" w:color="BFBFBF" w:sz="4"/>
+              <w:left w:val="single" w:color="BFBFBF" w:sz="4"/>
+              <w:bottom w:val="single" w:color="BFBFBF" w:sz="4"/>
+              <w:right w:val="single" w:color="BFBFBF" w:sz="4"/>
+            </w:tcBorders>
+            <w:shd w:fill="FFFFFF" w:val="clear"/>
+            <w:tcMar>
+              <w:top w:type="dxa" w:w="60"/>
+              <w:left w:type="dxa" w:w="110"/>
+              <w:bottom w:type="dxa" w:w="60"/>
+              <w:right w:type="dxa" w:w="110"/>
+            </w:tcMar>
+            <w:vAlign w:val="center"/>
+          </w:tcPr>
+          <w:p>
+            <w:pPr>
+              <w:spacing w:line="252" w:lineRule="auto" w:after="0"/>
+              <w:jc w:val="left"/>
+            </w:pPr>
+            <w:r>
+              <w:rPr>
+                <w:b w:val="false"/>
+                <w:bCs w:val="false"/>
+                <w:sz w:val="18"/>
+                <w:szCs w:val="18"/>
+                <w:rFonts w:ascii="Consolas" w:cs="Consolas" w:eastAsia="Consolas" w:hAnsi="Consolas"/>
+              </w:rPr>
+              <w:t xml:space="preserve">reserva.service.js</w:t>
+            </w:r>
+          </w:p>
+        </w:tc>
+        <w:tc>
+          <w:tcPr>
+            <w:tcW w:type="dxa" w:w="1575"/>
+            <w:tcBorders>
+              <w:top w:val="single" w:color="BFBFBF" w:sz="4"/>
+              <w:left w:val="single" w:color="BFBFBF" w:sz="4"/>
+              <w:bottom w:val="single" w:color="BFBFBF" w:sz="4"/>
+              <w:right w:val="single" w:color="BFBFBF" w:sz="4"/>
+            </w:tcBorders>
+            <w:shd w:fill="FFFFFF" w:val="clear"/>
+            <w:tcMar>
+              <w:top w:type="dxa" w:w="60"/>
+              <w:left w:type="dxa" w:w="110"/>
+              <w:bottom w:type="dxa" w:w="60"/>
+              <w:right w:type="dxa" w:w="110"/>
+            </w:tcMar>
+            <w:vAlign w:val="center"/>
+          </w:tcPr>
+          <w:p>
+            <w:pPr>
+              <w:spacing w:line="252" w:lineRule="auto" w:after="0"/>
+              <w:jc w:val="center"/>
+            </w:pPr>
+            <w:r>
+              <w:rPr>
+                <w:b w:val="false"/>
+                <w:bCs w:val="false"/>
+              </w:rPr>
+              <w:t xml:space="preserve">78.57</w:t>
+            </w:r>
+          </w:p>
+        </w:tc>
+        <w:tc>
+          <w:tcPr>
+            <w:tcW w:type="dxa" w:w="1575"/>
+            <w:tcBorders>
+              <w:top w:val="single" w:color="BFBFBF" w:sz="4"/>
+              <w:left w:val="single" w:color="BFBFBF" w:sz="4"/>
+              <w:bottom w:val="single" w:color="BFBFBF" w:sz="4"/>
+              <w:right w:val="single" w:color="BFBFBF" w:sz="4"/>
+            </w:tcBorders>
+            <w:shd w:fill="FFFFFF" w:val="clear"/>
+            <w:tcMar>
+              <w:top w:type="dxa" w:w="60"/>
+              <w:left w:type="dxa" w:w="110"/>
+              <w:bottom w:type="dxa" w:w="60"/>
+              <w:right w:type="dxa" w:w="110"/>
+            </w:tcMar>
+            <w:vAlign w:val="center"/>
+          </w:tcPr>
+          <w:p>
+            <w:pPr>
+              <w:spacing w:line="252" w:lineRule="auto" w:after="0"/>
+              <w:jc w:val="center"/>
+            </w:pPr>
+            <w:r>
+              <w:rPr>
+                <w:b w:val="false"/>
+                <w:bCs w:val="false"/>
+              </w:rPr>
+              <w:t xml:space="preserve">100</w:t>
+            </w:r>
+          </w:p>
+        </w:tc>
+        <w:tc>
+          <w:tcPr>
+            <w:tcW w:type="dxa" w:w="1575"/>
+            <w:tcBorders>
+              <w:top w:val="single" w:color="BFBFBF" w:sz="4"/>
+              <w:left w:val="single" w:color="BFBFBF" w:sz="4"/>
+              <w:bottom w:val="single" w:color="BFBFBF" w:sz="4"/>
+              <w:right w:val="single" w:color="BFBFBF" w:sz="4"/>
+            </w:tcBorders>
+            <w:shd w:fill="FFFFFF" w:val="clear"/>
+            <w:tcMar>
+              <w:top w:type="dxa" w:w="60"/>
+              <w:left w:type="dxa" w:w="110"/>
+              <w:bottom w:type="dxa" w:w="60"/>
+              <w:right w:type="dxa" w:w="110"/>
+            </w:tcMar>
+            <w:vAlign w:val="center"/>
+          </w:tcPr>
+          <w:p>
+            <w:pPr>
+              <w:spacing w:line="252" w:lineRule="auto" w:after="0"/>
+              <w:jc w:val="center"/>
+            </w:pPr>
+            <w:r>
+              <w:rPr>
+                <w:b w:val="false"/>
+                <w:bCs w:val="false"/>
+              </w:rPr>
+              <w:t xml:space="preserve">50</w:t>
+            </w:r>
+          </w:p>
+        </w:tc>
+        <w:tc>
+          <w:tcPr>
+            <w:tcW w:type="dxa" w:w="1575"/>
+            <w:tcBorders>
+              <w:top w:val="single" w:color="BFBFBF" w:sz="4"/>
+              <w:left w:val="single" w:color="BFBFBF" w:sz="4"/>
+              <w:bottom w:val="single" w:color="BFBFBF" w:sz="4"/>
+              <w:right w:val="single" w:color="BFBFBF" w:sz="4"/>
+            </w:tcBorders>
+            <w:shd w:fill="FFFFFF" w:val="clear"/>
+            <w:tcMar>
+              <w:top w:type="dxa" w:w="60"/>
+              <w:left w:type="dxa" w:w="110"/>
+              <w:bottom w:type="dxa" w:w="60"/>
+              <w:right w:type="dxa" w:w="110"/>
+            </w:tcMar>
+            <w:vAlign w:val="center"/>
+          </w:tcPr>
+          <w:p>
+            <w:pPr>
+              <w:spacing w:line="252" w:lineRule="auto" w:after="0"/>
+              <w:jc w:val="center"/>
+            </w:pPr>
+            <w:r>
+              <w:rPr>
+                <w:b w:val="false"/>
+                <w:bCs w:val="false"/>
+              </w:rPr>
+              <w:t xml:space="preserve">78.57</w:t>
+            </w:r>
+          </w:p>
+        </w:tc>
+      </w:tr>
+      <w:tr>
+        <w:tc>
+          <w:tcPr>
+            <w:tcW w:type="dxa" w:w="2772"/>
+            <w:tcBorders>
+              <w:top w:val="single" w:color="BFBFBF" w:sz="4"/>
+              <w:left w:val="single" w:color="BFBFBF" w:sz="4"/>
+              <w:bottom w:val="single" w:color="BFBFBF" w:sz="4"/>
+              <w:right w:val="single" w:color="BFBFBF" w:sz="4"/>
+            </w:tcBorders>
+            <w:shd w:fill="FFFFFF" w:val="clear"/>
+            <w:tcMar>
+              <w:top w:type="dxa" w:w="60"/>
+              <w:left w:type="dxa" w:w="110"/>
+              <w:bottom w:type="dxa" w:w="60"/>
+              <w:right w:type="dxa" w:w="110"/>
+            </w:tcMar>
+            <w:vAlign w:val="center"/>
+          </w:tcPr>
+          <w:p>
+            <w:pPr>
+              <w:spacing w:line="252" w:lineRule="auto" w:after="0"/>
+              <w:jc w:val="left"/>
+            </w:pPr>
+            <w:r>
+              <w:rPr>
+                <w:b w:val="false"/>
+                <w:bCs w:val="false"/>
+                <w:sz w:val="18"/>
+                <w:szCs w:val="18"/>
+                <w:rFonts w:ascii="Consolas" w:cs="Consolas" w:eastAsia="Consolas" w:hAnsi="Consolas"/>
+              </w:rPr>
               <w:t xml:space="preserve">api.js</w:t>
             </w:r>
           </w:p>
         </w:tc>
         <w:tc>
           <w:tcPr>
-            <w:tcW w:type="dxa" w:w="1500"/>
+            <w:tcW w:type="dxa" w:w="1575"/>
             <w:tcBorders>
               <w:top w:val="single" w:color="BFBFBF" w:sz="4"/>
               <w:left w:val="single" w:color="BFBFBF" w:sz="4"/>
@@ -3803,13 +5227,13 @@
                 <w:b w:val="false"/>
                 <w:bCs w:val="false"/>
               </w:rPr>
-              <w:t xml:space="preserve">60</w:t>
-            </w:r>
-          </w:p>
-        </w:tc>
-        <w:tc>
-          <w:tcPr>
-            <w:tcW w:type="dxa" w:w="1500"/>
+              <w:t xml:space="preserve">39.58</w:t>
+            </w:r>
+          </w:p>
+        </w:tc>
+        <w:tc>
+          <w:tcPr>
+            <w:tcW w:type="dxa" w:w="1575"/>
             <w:tcBorders>
               <w:top w:val="single" w:color="BFBFBF" w:sz="4"/>
               <w:left w:val="single" w:color="BFBFBF" w:sz="4"/>
@@ -3835,13 +5259,13 @@
                 <w:b w:val="false"/>
                 <w:bCs w:val="false"/>
               </w:rPr>
-              <w:t xml:space="preserve">40</w:t>
-            </w:r>
-          </w:p>
-        </w:tc>
-        <w:tc>
-          <w:tcPr>
-            <w:tcW w:type="dxa" w:w="1500"/>
+              <w:t xml:space="preserve">25</w:t>
+            </w:r>
+          </w:p>
+        </w:tc>
+        <w:tc>
+          <w:tcPr>
+            <w:tcW w:type="dxa" w:w="1575"/>
             <w:tcBorders>
               <w:top w:val="single" w:color="BFBFBF" w:sz="4"/>
               <w:left w:val="single" w:color="BFBFBF" w:sz="4"/>
@@ -3867,13 +5291,13 @@
                 <w:b w:val="false"/>
                 <w:bCs w:val="false"/>
               </w:rPr>
-              <w:t xml:space="preserve">33.33</w:t>
-            </w:r>
-          </w:p>
-        </w:tc>
-        <w:tc>
-          <w:tcPr>
-            <w:tcW w:type="dxa" w:w="1500"/>
+              <w:t xml:space="preserve">12.50</w:t>
+            </w:r>
+          </w:p>
+        </w:tc>
+        <w:tc>
+          <w:tcPr>
+            <w:tcW w:type="dxa" w:w="1575"/>
             <w:tcBorders>
               <w:top w:val="single" w:color="BFBFBF" w:sz="4"/>
               <w:left w:val="single" w:color="BFBFBF" w:sz="4"/>
@@ -3899,7 +5323,7 @@
                 <w:b w:val="false"/>
                 <w:bCs w:val="false"/>
               </w:rPr>
-              <w:t xml:space="preserve">59.25</w:t>
+              <w:t xml:space="preserve">38.63</w:t>
             </w:r>
           </w:p>
         </w:tc>
@@ -3911,29 +5335,7 @@
         <w:jc w:val="both"/>
       </w:pPr>
       <w:r>
-        <w:t xml:space="preserve">La cobertura se concentra deliberadamente en la lógica de dominio y en el cliente del orquestador. El archivo </w:t>
-      </w:r>
-      <w:r>
-        <w:rPr>
-          <w:sz w:val="20"/>
-          <w:szCs w:val="20"/>
-          <w:rFonts w:ascii="Consolas" w:cs="Consolas" w:eastAsia="Consolas" w:hAnsi="Consolas"/>
-        </w:rPr>
-        <w:t xml:space="preserve">api.test.js</w:t>
-      </w:r>
-      <w:r>
-        <w:t xml:space="preserve"> (6 pruebas del BFF) se ejecuta con el runner nativo </w:t>
-      </w:r>
-      <w:r>
-        <w:rPr>
-          <w:sz w:val="20"/>
-          <w:szCs w:val="20"/>
-          <w:rFonts w:ascii="Consolas" w:cs="Consolas" w:eastAsia="Consolas" w:hAnsi="Consolas"/>
-        </w:rPr>
-        <w:t xml:space="preserve">node:test</w:t>
-      </w:r>
-      <w:r>
-        <w:t xml:space="preserve">, por lo que su aporte de cobertura no aparece en el reporte de Jest, aunque su contrato sí queda verificado.</w:t>
+        <w:t xml:space="preserve">La cobertura global es del 73.15 % de sentencias. La lógica de negocio (pricing, payments, comunas-chile, rateLimit) está prácticamente cubierta en su totalidad. El orquestador api.js presenta una cobertura menor (39.58 %) porque incorpora numerosas rutas y ramas de error que se ejercitan parcialmente; ampliarla es la principal oportunidad de mejora (ver sección 9).</w:t>
       </w:r>
     </w:p>
     <w:p>
@@ -3951,7 +5353,7 @@
         <w:jc w:val="both"/>
       </w:pPr>
       <w:r>
-        <w:t xml:space="preserve">A continuación se transcribe la salida real de la ejecución de las pruebas, de modo que el informe es autocontenido y verificable. Las capturas pueden regenerarse ejecutando los comandos de la sección 8.</w:t>
+        <w:t xml:space="preserve">A continuación se transcribe la salida real de la ejecución, de modo que el informe es autocontenido y verificable. Las capturas pueden regenerarse ejecutando los comandos de la sección 8.</w:t>
       </w:r>
     </w:p>
     <w:p>
@@ -3964,7 +5366,7 @@
           <w:b/>
           <w:bCs/>
         </w:rPr>
-        <w:t xml:space="preserve">Evidencia 1 — Pruebas de integración del BFF (node:test):</w:t>
+        <w:t xml:space="preserve">Evidencia 1 — Suite Jest con cobertura (71 casos):</w:t>
       </w:r>
     </w:p>
     <w:p>
@@ -3982,7 +5384,7 @@
           <w:szCs w:val="18"/>
           <w:rFonts w:ascii="Consolas" w:cs="Consolas" w:eastAsia="Consolas" w:hAnsi="Consolas"/>
         </w:rPr>
-        <w:t xml:space="preserve">PS apps/web&gt; node --test tests/api.test.js</w:t>
+        <w:t xml:space="preserve">PS (raiz)&gt; npx jest --coverage</w:t>
       </w:r>
     </w:p>
     <w:p>
@@ -3999,7 +5401,7 @@
           <w:szCs w:val="18"/>
           <w:rFonts w:ascii="Consolas" w:cs="Consolas" w:eastAsia="Consolas" w:hAnsi="Consolas"/>
         </w:rPr>
-        <w:t xml:space="preserve">✔ BFF - Mapas: Deberia actualizar ocupacion correctamente</w:t>
+        <w:t xml:space="preserve">PASS  apps/web/tests/pricing.test.js</w:t>
       </w:r>
     </w:p>
     <w:p>
@@ -4016,7 +5418,7 @@
           <w:szCs w:val="18"/>
           <w:rFonts w:ascii="Consolas" w:cs="Consolas" w:eastAsia="Consolas" w:hAnsi="Consolas"/>
         </w:rPr>
-        <w:t xml:space="preserve">✔ BFF - Mapas: Deberia fallar al exceder capacidad en PATCH</w:t>
+        <w:t xml:space="preserve">PASS  apps/web/tests/payments.test.js</w:t>
       </w:r>
     </w:p>
     <w:p>
@@ -4033,7 +5435,7 @@
           <w:szCs w:val="18"/>
           <w:rFonts w:ascii="Consolas" w:cs="Consolas" w:eastAsia="Consolas" w:hAnsi="Consolas"/>
         </w:rPr>
-        <w:t xml:space="preserve">✔ BFF - Reservas (Saga): Deberia verificar disponibilidad</w:t>
+        <w:t xml:space="preserve">PASS  apps/web/tests/geocoding.test.js</w:t>
       </w:r>
     </w:p>
     <w:p>
@@ -4050,7 +5452,7 @@
           <w:szCs w:val="18"/>
           <w:rFonts w:ascii="Consolas" w:cs="Consolas" w:eastAsia="Consolas" w:hAnsi="Consolas"/>
         </w:rPr>
-        <w:t xml:space="preserve">✔ BFF - Reservas (Saga): Deberia rechazar si esta lleno</w:t>
+        <w:t xml:space="preserve">PASS  apps/web/tests/rateLimit.test.js</w:t>
       </w:r>
     </w:p>
     <w:p>
@@ -4067,7 +5469,7 @@
           <w:szCs w:val="18"/>
           <w:rFonts w:ascii="Consolas" w:cs="Consolas" w:eastAsia="Consolas" w:hAnsi="Consolas"/>
         </w:rPr>
-        <w:t xml:space="preserve">✔ BFF - Reservas (Saga): Deberia crear reserva con exito</w:t>
+        <w:t xml:space="preserve">PASS  apps/web/tests/api.timeout.test.js</w:t>
       </w:r>
     </w:p>
     <w:p>
@@ -4084,7 +5486,109 @@
           <w:szCs w:val="18"/>
           <w:rFonts w:ascii="Consolas" w:cs="Consolas" w:eastAsia="Consolas" w:hAnsi="Consolas"/>
         </w:rPr>
-        <w:t xml:space="preserve">✔ BFF - Reservas (Saga): Deberia manejar el error si la Saga falla</w:t>
+        <w:t xml:space="preserve">PASS  apps/ms-reservas/tests/reserveService.test.js</w:t>
+      </w:r>
+    </w:p>
+    <w:p>
+      <w:pPr>
+        <w:pBdr>
+          <w:left w:val="single" w:color="1F4E79" w:sz="12" w:space="6"/>
+        </w:pBdr>
+        <w:shd w:fill="F5F5F5" w:val="clear"/>
+        <w:spacing w:line="240" w:lineRule="auto" w:after="0" w:before="0"/>
+      </w:pPr>
+      <w:r>
+        <w:rPr>
+          <w:sz w:val="18"/>
+          <w:szCs w:val="18"/>
+          <w:rFonts w:ascii="Consolas" w:cs="Consolas" w:eastAsia="Consolas" w:hAnsi="Consolas"/>
+        </w:rPr>
+        <w:t xml:space="preserve">----------------------|---------|----------|---------|---------|</w:t>
+      </w:r>
+    </w:p>
+    <w:p>
+      <w:pPr>
+        <w:pBdr>
+          <w:left w:val="single" w:color="1F4E79" w:sz="12" w:space="6"/>
+        </w:pBdr>
+        <w:shd w:fill="F5F5F5" w:val="clear"/>
+        <w:spacing w:line="240" w:lineRule="auto" w:after="0" w:before="0"/>
+      </w:pPr>
+      <w:r>
+        <w:rPr>
+          <w:sz w:val="18"/>
+          <w:szCs w:val="18"/>
+          <w:rFonts w:ascii="Consolas" w:cs="Consolas" w:eastAsia="Consolas" w:hAnsi="Consolas"/>
+        </w:rPr>
+        <w:t xml:space="preserve">File                  | % Stmts | % Branch | % Funcs | % Lines |</w:t>
+      </w:r>
+    </w:p>
+    <w:p>
+      <w:pPr>
+        <w:pBdr>
+          <w:left w:val="single" w:color="1F4E79" w:sz="12" w:space="6"/>
+        </w:pBdr>
+        <w:shd w:fill="F5F5F5" w:val="clear"/>
+        <w:spacing w:line="240" w:lineRule="auto" w:after="0" w:before="0"/>
+      </w:pPr>
+      <w:r>
+        <w:rPr>
+          <w:sz w:val="18"/>
+          <w:szCs w:val="18"/>
+          <w:rFonts w:ascii="Consolas" w:cs="Consolas" w:eastAsia="Consolas" w:hAnsi="Consolas"/>
+        </w:rPr>
+        <w:t xml:space="preserve">----------------------|---------|----------|---------|---------|</w:t>
+      </w:r>
+    </w:p>
+    <w:p>
+      <w:pPr>
+        <w:pBdr>
+          <w:left w:val="single" w:color="1F4E79" w:sz="12" w:space="6"/>
+        </w:pBdr>
+        <w:shd w:fill="F5F5F5" w:val="clear"/>
+        <w:spacing w:line="240" w:lineRule="auto" w:after="0" w:before="0"/>
+      </w:pPr>
+      <w:r>
+        <w:rPr>
+          <w:sz w:val="18"/>
+          <w:szCs w:val="18"/>
+          <w:rFonts w:ascii="Consolas" w:cs="Consolas" w:eastAsia="Consolas" w:hAnsi="Consolas"/>
+        </w:rPr>
+        <w:t xml:space="preserve">All files             |  73.15  |   70.43  |  41.46  |  72.85  |</w:t>
+      </w:r>
+    </w:p>
+    <w:p>
+      <w:pPr>
+        <w:pBdr>
+          <w:left w:val="single" w:color="1F4E79" w:sz="12" w:space="6"/>
+        </w:pBdr>
+        <w:shd w:fill="F5F5F5" w:val="clear"/>
+        <w:spacing w:line="240" w:lineRule="auto" w:after="0" w:before="0"/>
+      </w:pPr>
+      <w:r>
+        <w:rPr>
+          <w:sz w:val="18"/>
+          <w:szCs w:val="18"/>
+          <w:rFonts w:ascii="Consolas" w:cs="Consolas" w:eastAsia="Consolas" w:hAnsi="Consolas"/>
+        </w:rPr>
+        <w:t xml:space="preserve">----------------------|---------|----------|---------|---------|</w:t>
+      </w:r>
+    </w:p>
+    <w:p>
+      <w:pPr>
+        <w:pBdr>
+          <w:left w:val="single" w:color="1F4E79" w:sz="12" w:space="6"/>
+        </w:pBdr>
+        <w:shd w:fill="F5F5F5" w:val="clear"/>
+        <w:spacing w:line="240" w:lineRule="auto" w:after="0" w:before="0"/>
+      </w:pPr>
+      <w:r>
+        <w:rPr>
+          <w:sz w:val="18"/>
+          <w:szCs w:val="18"/>
+          <w:rFonts w:ascii="Consolas" w:cs="Consolas" w:eastAsia="Consolas" w:hAnsi="Consolas"/>
+        </w:rPr>
+        <w:t xml:space="preserve">Test Suites: 6 passed, 6 total</w:t>
       </w:r>
     </w:p>
     <w:p>
@@ -4102,13 +5606,12 @@
           <w:szCs w:val="18"/>
           <w:rFonts w:ascii="Consolas" w:cs="Consolas" w:eastAsia="Consolas" w:hAnsi="Consolas"/>
         </w:rPr>
-        <w:t xml:space="preserve">i tests 6   |   i pass 6   |   i fail 0</w:t>
+        <w:t xml:space="preserve">Tests:       71 passed, 71 total</w:t>
       </w:r>
     </w:p>
     <w:p>
       <w:pPr>
         <w:spacing w:before="60" w:after="200"/>
-        <w:jc w:val="left"/>
       </w:pPr>
       <w:r>
         <w:rPr>
@@ -4118,7 +5621,7 @@
           <w:sz w:val="18"/>
           <w:szCs w:val="18"/>
         </w:rPr>
-        <w:t xml:space="preserve">Evidencia 1: 6/6 pruebas del BFF aprobadas (node:test).</w:t>
+        <w:t xml:space="preserve">Evidencia 1: 6 suites y 71 pruebas Jest aprobadas, con reporte de cobertura global 73.15 %.</w:t>
       </w:r>
     </w:p>
     <w:p>
@@ -4131,7 +5634,7 @@
           <w:b/>
           <w:bCs/>
         </w:rPr>
-        <w:t xml:space="preserve">Evidencia 2 — Pruebas Jest con cobertura (dominio + resiliencia):</w:t>
+        <w:t xml:space="preserve">Evidencia 2 — Integración del BFF (node:test, 6 casos):</w:t>
       </w:r>
     </w:p>
     <w:p>
@@ -4149,7 +5652,7 @@
           <w:szCs w:val="18"/>
           <w:rFonts w:ascii="Consolas" w:cs="Consolas" w:eastAsia="Consolas" w:hAnsi="Consolas"/>
         </w:rPr>
-        <w:t xml:space="preserve">PS (raiz)&gt; npx jest --coverage</w:t>
+        <w:t xml:space="preserve">PS apps/web&gt; node --test tests/api.test.js</w:t>
       </w:r>
     </w:p>
     <w:p>
@@ -4166,7 +5669,7 @@
           <w:szCs w:val="18"/>
           <w:rFonts w:ascii="Consolas" w:cs="Consolas" w:eastAsia="Consolas" w:hAnsi="Consolas"/>
         </w:rPr>
-        <w:t xml:space="preserve">PASS  apps/ms-reservas/tests/reserveService.test.js</w:t>
+        <w:t xml:space="preserve">ok 1 - BFF - Mapas: actualizar ocupacion correctamente</w:t>
       </w:r>
     </w:p>
     <w:p>
@@ -4183,7 +5686,7 @@
           <w:szCs w:val="18"/>
           <w:rFonts w:ascii="Consolas" w:cs="Consolas" w:eastAsia="Consolas" w:hAnsi="Consolas"/>
         </w:rPr>
-        <w:t xml:space="preserve">PASS  apps/web/tests/api.timeout.test.js</w:t>
+        <w:t xml:space="preserve">ok 2 - BFF - Mapas: falla al exceder capacidad en PATCH</w:t>
       </w:r>
     </w:p>
     <w:p>
@@ -4200,7 +5703,7 @@
           <w:szCs w:val="18"/>
           <w:rFonts w:ascii="Consolas" w:cs="Consolas" w:eastAsia="Consolas" w:hAnsi="Consolas"/>
         </w:rPr>
-        <w:t xml:space="preserve">--------------------------|---------|----------|---------|---------|</w:t>
+        <w:t xml:space="preserve">ok 3 - BFF - Reservas: verificar disponibilidad (plaza libre)</w:t>
       </w:r>
     </w:p>
     <w:p>
@@ -4217,7 +5720,7 @@
           <w:szCs w:val="18"/>
           <w:rFonts w:ascii="Consolas" w:cs="Consolas" w:eastAsia="Consolas" w:hAnsi="Consolas"/>
         </w:rPr>
-        <w:t xml:space="preserve">File                      | % Stmts | % Branch | % Funcs | % Lines |</w:t>
+        <w:t xml:space="preserve">ok 4 - BFF - Reservas: verificar disponibilidad (plaza llena)</w:t>
       </w:r>
     </w:p>
     <w:p>
@@ -4234,7 +5737,7 @@
           <w:szCs w:val="18"/>
           <w:rFonts w:ascii="Consolas" w:cs="Consolas" w:eastAsia="Consolas" w:hAnsi="Consolas"/>
         </w:rPr>
-        <w:t xml:space="preserve">--------------------------|---------|----------|---------|---------|</w:t>
+        <w:t xml:space="preserve">ok 5 - BFF - Reservas: crear reserva con exito</w:t>
       </w:r>
     </w:p>
     <w:p>
@@ -4251,75 +5754,7 @@
           <w:szCs w:val="18"/>
           <w:rFonts w:ascii="Consolas" w:cs="Consolas" w:eastAsia="Consolas" w:hAnsi="Consolas"/>
         </w:rPr>
-        <w:t xml:space="preserve">All files                 |   62.71 |   47.36  |  30.76  |  62.50  |</w:t>
-      </w:r>
-    </w:p>
-    <w:p>
-      <w:pPr>
-        <w:pBdr>
-          <w:left w:val="single" w:color="1F4E79" w:sz="12" w:space="6"/>
-        </w:pBdr>
-        <w:shd w:fill="F5F5F5" w:val="clear"/>
-        <w:spacing w:line="240" w:lineRule="auto" w:after="0" w:before="0"/>
-      </w:pPr>
-      <w:r>
-        <w:rPr>
-          <w:sz w:val="18"/>
-          <w:szCs w:val="18"/>
-          <w:rFonts w:ascii="Consolas" w:cs="Consolas" w:eastAsia="Consolas" w:hAnsi="Consolas"/>
-        </w:rPr>
-        <w:t xml:space="preserve"> reserva.service.js       |   78.57 |   100    |  50     |  78.57  |</w:t>
-      </w:r>
-    </w:p>
-    <w:p>
-      <w:pPr>
-        <w:pBdr>
-          <w:left w:val="single" w:color="1F4E79" w:sz="12" w:space="6"/>
-        </w:pBdr>
-        <w:shd w:fill="F5F5F5" w:val="clear"/>
-        <w:spacing w:line="240" w:lineRule="auto" w:after="0" w:before="0"/>
-      </w:pPr>
-      <w:r>
-        <w:rPr>
-          <w:sz w:val="18"/>
-          <w:szCs w:val="18"/>
-          <w:rFonts w:ascii="Consolas" w:cs="Consolas" w:eastAsia="Consolas" w:hAnsi="Consolas"/>
-        </w:rPr>
-        <w:t xml:space="preserve"> api.js                   |   60    |   40     |  33.33  |  59.25  |</w:t>
-      </w:r>
-    </w:p>
-    <w:p>
-      <w:pPr>
-        <w:pBdr>
-          <w:left w:val="single" w:color="1F4E79" w:sz="12" w:space="6"/>
-        </w:pBdr>
-        <w:shd w:fill="F5F5F5" w:val="clear"/>
-        <w:spacing w:line="240" w:lineRule="auto" w:after="0" w:before="0"/>
-      </w:pPr>
-      <w:r>
-        <w:rPr>
-          <w:sz w:val="18"/>
-          <w:szCs w:val="18"/>
-          <w:rFonts w:ascii="Consolas" w:cs="Consolas" w:eastAsia="Consolas" w:hAnsi="Consolas"/>
-        </w:rPr>
-        <w:t xml:space="preserve">--------------------------|---------|----------|---------|---------|</w:t>
-      </w:r>
-    </w:p>
-    <w:p>
-      <w:pPr>
-        <w:pBdr>
-          <w:left w:val="single" w:color="1F4E79" w:sz="12" w:space="6"/>
-        </w:pBdr>
-        <w:shd w:fill="F5F5F5" w:val="clear"/>
-        <w:spacing w:line="240" w:lineRule="auto" w:after="0" w:before="0"/>
-      </w:pPr>
-      <w:r>
-        <w:rPr>
-          <w:sz w:val="18"/>
-          <w:szCs w:val="18"/>
-          <w:rFonts w:ascii="Consolas" w:cs="Consolas" w:eastAsia="Consolas" w:hAnsi="Consolas"/>
-        </w:rPr>
-        <w:t xml:space="preserve">Test Suites: 2 passed, 2 total</w:t>
+        <w:t xml:space="preserve">ok 6 - BFF - Reservas: maneja error si falla la creacion</w:t>
       </w:r>
     </w:p>
     <w:p>
@@ -4337,13 +5772,12 @@
           <w:szCs w:val="18"/>
           <w:rFonts w:ascii="Consolas" w:cs="Consolas" w:eastAsia="Consolas" w:hAnsi="Consolas"/>
         </w:rPr>
-        <w:t xml:space="preserve">Tests:       4 passed, 4 total</w:t>
+        <w:t xml:space="preserve">i tests 6   |   i pass 6   |   i fail 0</w:t>
       </w:r>
     </w:p>
     <w:p>
       <w:pPr>
         <w:spacing w:before="60" w:after="200"/>
-        <w:jc w:val="left"/>
       </w:pPr>
       <w:r>
         <w:rPr>
@@ -4353,7 +5787,7 @@
           <w:sz w:val="18"/>
           <w:szCs w:val="18"/>
         </w:rPr>
-        <w:t xml:space="preserve">Evidencia 2: 2 suites y 4 pruebas Jest aprobadas, con reporte de cobertura.</w:t>
+        <w:t xml:space="preserve">Evidencia 2: 6/6 pruebas del BFF aprobadas (node:test).</w:t>
       </w:r>
     </w:p>
     <w:p>
@@ -4440,7 +5874,58 @@
           <w:szCs w:val="18"/>
           <w:rFonts w:ascii="Consolas" w:cs="Consolas" w:eastAsia="Consolas" w:hAnsi="Consolas"/>
         </w:rPr>
-        <w:t xml:space="preserve"># 1) Pruebas de integracion del BFF (node:test) -&gt; 6 pruebas</w:t>
+        <w:t xml:space="preserve"># 1) Suite de negocio, dominio y resiliencia (Jest) + cobertura -&gt; 71 pruebas</w:t>
+      </w:r>
+    </w:p>
+    <w:p>
+      <w:pPr>
+        <w:pBdr>
+          <w:left w:val="single" w:color="1F4E79" w:sz="12" w:space="6"/>
+        </w:pBdr>
+        <w:shd w:fill="F5F5F5" w:val="clear"/>
+        <w:spacing w:line="240" w:lineRule="auto" w:after="0" w:before="0"/>
+      </w:pPr>
+      <w:r>
+        <w:rPr>
+          <w:sz w:val="18"/>
+          <w:szCs w:val="18"/>
+          <w:rFonts w:ascii="Consolas" w:cs="Consolas" w:eastAsia="Consolas" w:hAnsi="Consolas"/>
+        </w:rPr>
+        <w:t xml:space="preserve">npx jest --coverage   # genera coverage/lcov-report/index.html</w:t>
+      </w:r>
+    </w:p>
+    <w:p>
+      <w:pPr>
+        <w:pBdr>
+          <w:left w:val="single" w:color="1F4E79" w:sz="12" w:space="6"/>
+        </w:pBdr>
+        <w:shd w:fill="F5F5F5" w:val="clear"/>
+        <w:spacing w:line="240" w:lineRule="auto" w:after="0" w:before="0"/>
+      </w:pPr>
+      <w:r>
+        <w:rPr>
+          <w:sz w:val="18"/>
+          <w:szCs w:val="18"/>
+          <w:rFonts w:ascii="Consolas" w:cs="Consolas" w:eastAsia="Consolas" w:hAnsi="Consolas"/>
+        </w:rPr>
+        <w:t xml:space="preserve"> </w:t>
+      </w:r>
+    </w:p>
+    <w:p>
+      <w:pPr>
+        <w:pBdr>
+          <w:left w:val="single" w:color="1F4E79" w:sz="12" w:space="6"/>
+        </w:pBdr>
+        <w:shd w:fill="F5F5F5" w:val="clear"/>
+        <w:spacing w:line="240" w:lineRule="auto" w:after="0" w:before="0"/>
+      </w:pPr>
+      <w:r>
+        <w:rPr>
+          <w:sz w:val="18"/>
+          <w:szCs w:val="18"/>
+          <w:rFonts w:ascii="Consolas" w:cs="Consolas" w:eastAsia="Consolas" w:hAnsi="Consolas"/>
+        </w:rPr>
+        <w:t xml:space="preserve"># 2) Integracion del BFF (node:test) -&gt; 6 pruebas</w:t>
       </w:r>
     </w:p>
     <w:p>
@@ -4463,6 +5948,7 @@
     <w:p>
       <w:pPr>
         <w:pBdr>
+          <w:bottom w:val="single" w:color="D9D9D9" w:sz="4" w:space="2"/>
           <w:left w:val="single" w:color="1F4E79" w:sz="12" w:space="6"/>
         </w:pBdr>
         <w:shd w:fill="F5F5F5" w:val="clear"/>
@@ -4474,76 +5960,7 @@
           <w:szCs w:val="18"/>
           <w:rFonts w:ascii="Consolas" w:cs="Consolas" w:eastAsia="Consolas" w:hAnsi="Consolas"/>
         </w:rPr>
-        <w:t xml:space="preserve">npm test            # ejecuta: node --test tests/api.test.js</w:t>
-      </w:r>
-    </w:p>
-    <w:p>
-      <w:pPr>
-        <w:pBdr>
-          <w:left w:val="single" w:color="1F4E79" w:sz="12" w:space="6"/>
-        </w:pBdr>
-        <w:shd w:fill="F5F5F5" w:val="clear"/>
-        <w:spacing w:line="240" w:lineRule="auto" w:after="0" w:before="0"/>
-      </w:pPr>
-      <w:r>
-        <w:rPr>
-          <w:sz w:val="18"/>
-          <w:szCs w:val="18"/>
-          <w:rFonts w:ascii="Consolas" w:cs="Consolas" w:eastAsia="Consolas" w:hAnsi="Consolas"/>
-        </w:rPr>
-        <w:t xml:space="preserve"> </w:t>
-      </w:r>
-    </w:p>
-    <w:p>
-      <w:pPr>
-        <w:pBdr>
-          <w:left w:val="single" w:color="1F4E79" w:sz="12" w:space="6"/>
-        </w:pBdr>
-        <w:shd w:fill="F5F5F5" w:val="clear"/>
-        <w:spacing w:line="240" w:lineRule="auto" w:after="0" w:before="0"/>
-      </w:pPr>
-      <w:r>
-        <w:rPr>
-          <w:sz w:val="18"/>
-          <w:szCs w:val="18"/>
-          <w:rFonts w:ascii="Consolas" w:cs="Consolas" w:eastAsia="Consolas" w:hAnsi="Consolas"/>
-        </w:rPr>
-        <w:t xml:space="preserve"># 2) Pruebas de dominio y resiliencia (Jest) + cobertura -&gt; 4 pruebas</w:t>
-      </w:r>
-    </w:p>
-    <w:p>
-      <w:pPr>
-        <w:pBdr>
-          <w:left w:val="single" w:color="1F4E79" w:sz="12" w:space="6"/>
-        </w:pBdr>
-        <w:shd w:fill="F5F5F5" w:val="clear"/>
-        <w:spacing w:line="240" w:lineRule="auto" w:after="0" w:before="0"/>
-      </w:pPr>
-      <w:r>
-        <w:rPr>
-          <w:sz w:val="18"/>
-          <w:szCs w:val="18"/>
-          <w:rFonts w:ascii="Consolas" w:cs="Consolas" w:eastAsia="Consolas" w:hAnsi="Consolas"/>
-        </w:rPr>
-        <w:t xml:space="preserve">cd ../..</w:t>
-      </w:r>
-    </w:p>
-    <w:p>
-      <w:pPr>
-        <w:pBdr>
-          <w:bottom w:val="single" w:color="D9D9D9" w:sz="4" w:space="2"/>
-          <w:left w:val="single" w:color="1F4E79" w:sz="12" w:space="6"/>
-        </w:pBdr>
-        <w:shd w:fill="F5F5F5" w:val="clear"/>
-        <w:spacing w:line="240" w:lineRule="auto" w:after="0" w:before="0"/>
-      </w:pPr>
-      <w:r>
-        <w:rPr>
-          <w:sz w:val="18"/>
-          <w:szCs w:val="18"/>
-          <w:rFonts w:ascii="Consolas" w:cs="Consolas" w:eastAsia="Consolas" w:hAnsi="Consolas"/>
-        </w:rPr>
-        <w:t xml:space="preserve">npx jest --coverage # genera coverage/lcov-report/index.html</w:t>
+        <w:t xml:space="preserve">npm test              # ejecuta: node --test tests/api.test.js</w:t>
       </w:r>
     </w:p>
     <w:p>
@@ -4581,7 +5998,7 @@
         <w:jc w:val="both"/>
       </w:pPr>
       <w:r>
-        <w:t xml:space="preserve">En aras de la transparencia, se documentan los límites actuales de la batería de pruebas y las líneas de trabajo recomendadas:</w:t>
+        <w:t xml:space="preserve">En aras de la transparencia, se documentan los límites actuales y las líneas de trabajo recomendadas:</w:t>
       </w:r>
     </w:p>
     <w:p>
@@ -4595,7 +6012,7 @@
         <w:jc w:val="both"/>
       </w:pPr>
       <w:r>
-        <w:t xml:space="preserve">La cobertura está concentrada en la lógica de dominio (Saga de reservas) y en el cliente del BFF; los controladores de ruta de Next.js y el paquete de acceso a datos (packages/supabase-db) aún no cuentan con pruebas dedicadas.</w:t>
+        <w:t xml:space="preserve">La cobertura del orquestador api.js (39.58 % de sentencias, 12.5 % de funciones) es baja porque concentra numerosas rutas (favoritos, pagos, premium, reseñas, soporte) que aún no tienen pruebas dedicadas. Es la principal oportunidad de mejora.</w:t>
       </w:r>
     </w:p>
     <w:p>
@@ -4609,7 +6026,7 @@
         <w:jc w:val="both"/>
       </w:pPr>
       <w:r>
-        <w:t xml:space="preserve">La cobertura global de funciones es perfectible: se recomienda añadir pruebas a más controladores de ruta del BFF para elevarla por encima del 60 % en todos los componentes.</w:t>
+        <w:t xml:space="preserve">Se recomienda añadir pruebas de contrato para el resto de las rutas del BFF, de modo de elevar la cobertura de funciones por encima del 60 % en todos los componentes.</w:t>
       </w:r>
     </w:p>
     <w:p>
@@ -4623,7 +6040,7 @@
         <w:jc w:val="both"/>
       </w:pPr>
       <w:r>
-        <w:t xml:space="preserve">Se recomienda incorporar pruebas de extremo a extremo (end-to-end) sobre el flujo de reserva completo, una vez disponible un entorno de integración con base de datos de prueba.</w:t>
+        <w:t xml:space="preserve">Se recomienda incorporar pruebas de extremo a extremo (end-to-end) del flujo de reserva completo, una vez disponible un entorno de integración con base de datos de prueba.</w:t>
       </w:r>
     </w:p>
     <w:p>
@@ -4641,7 +6058,7 @@
         <w:jc w:val="both"/>
       </w:pPr>
       <w:r>
-        <w:t xml:space="preserve">Las 10 pruebas automatizadas implementadas se ejecutan de forma satisfactoria (100 % aprobadas), de manera determinista y sin dependencias externas, validando los componentes centrales del sistema.</w:t>
+        <w:t xml:space="preserve">Las 77 pruebas automatizadas se ejecutan de forma satisfactoria (100 % aprobadas), de manera determinista y sin dependencias externas, validando los componentes centrales del sistema.</w:t>
       </w:r>
     </w:p>
     <w:p>
@@ -4650,7 +6067,7 @@
         <w:jc w:val="both"/>
       </w:pPr>
       <w:r>
-        <w:t xml:space="preserve">La lógica crítica de negocio queda respaldada: el patrón Saga del microservicio de reservas valida el control de capacidad (CQRS) y revierte correctamente ante fallos (compensación, con sus ramas cubiertas al 100 %), mientras que el orquestador (BFF) gestiona de forma controlada los escenarios de error y de latencia mediante timeout y respuesta de respaldo.</w:t>
+        <w:t xml:space="preserve">La lógica crítica de negocio está muy cubierta: precios, pagos, geocodificación y limitación de peticiones alcanzan cobertura cercana al 100 %. La robustez transaccional queda demostrada: la Saga del microservicio de reservas valida la capacidad (CQRS) y revierte ante fallos (compensación, con ramas al 100 %), y el orquestador (BFF) gestiona de forma controlada los errores y la latencia mediante timeout y respuesta de respaldo.</w:t>
       </w:r>
     </w:p>
     <w:p>
@@ -4659,7 +6076,7 @@
         <w:jc w:val="both"/>
       </w:pPr>
       <w:r>
-        <w:t xml:space="preserve">En conjunto, la batería de pruebas constituye evidencia objetiva de que los componentes centrales de Parkings Together se comportan según lo esperado y quedan protegidos ante regresiones, sentando además una base clara para ampliar la cobertura a las áreas señaladas en la sección 9.</w:t>
+        <w:t xml:space="preserve">En conjunto, la batería de pruebas constituye evidencia objetiva de que los componentes centrales de Parkings Together se comportan según lo esperado y quedan protegidos ante regresiones, dejando una base clara para ampliar la cobertura a las áreas señaladas en la sección 9.</w:t>
       </w:r>
     </w:p>
     <w:sectPr>

</xml_diff>

<commit_message>
docs(entrega): rellenar Docente e Integrantes en el informe de pruebas (.docx)
- Docente: Joan Toro
- Integrantes: Jefferson Rojas, Gabriel Molina, Guillermo Santander

La portada del informe tenia esos campos en blanco (placeholders ____).
NOTA: el PDF (03_Informe_Pruebas.pdf) debe regenerarse desde este .docx
(Archivo > Exportar a PDF); el entorno cloud no puede renderizarlo.

https://claude.ai/code/session_016z2uyPsxZD8ZjodR5xe1KX
</commit_message>
<xml_diff>
--- a/ENTREGA_PARCIAL3/03_Informe_Pruebas.docx
+++ b/ENTREGA_PARCIAL3/03_Informe_Pruebas.docx
@@ -478,7 +478,7 @@
                 <w:b w:val="false"/>
                 <w:bCs w:val="false"/>
               </w:rPr>
-              <w:t xml:space="preserve">________________________________________</w:t>
+              <w:t xml:space="preserve">Joan Toro</w:t>
             </w:r>
           </w:p>
         </w:tc>
@@ -544,7 +544,7 @@
                 <w:b w:val="false"/>
                 <w:bCs w:val="false"/>
               </w:rPr>
-              <w:t xml:space="preserve">________________________________________</w:t>
+              <w:t xml:space="preserve">Jefferson Rojas, Gabriel Molina, Guillermo Santander</w:t>
             </w:r>
           </w:p>
         </w:tc>

</xml_diff>

<commit_message>
docs(entrega): embeber imagenes de evidencia (jest + node:test) en el informe
- Evidencia 1: captura de 'npx jest --coverage' (71 passed, 6 suites, cobertura 73.15%)
- Evidencia 2: captura de 'node --test' (6/6 contratos BFF)

Imagenes generadas desde la ejecucion REAL actual (no las del informe viejo,
que mostraban 10 pruebas/62.71%). El .docx queda listo; el PDF se exporta desde el.

https://claude.ai/code/session_016z2uyPsxZD8ZjodR5xe1KX
</commit_message>
<xml_diff>
--- a/ENTREGA_PARCIAL3/03_Informe_Pruebas.docx
+++ b/ENTREGA_PARCIAL3/03_Informe_Pruebas.docx
@@ -5611,6 +5611,49 @@
     </w:p>
     <w:p>
       <w:pPr>
+        <w:spacing w:before="120" w:after="120"/>
+        <w:jc w:val="center"/>
+      </w:pPr>
+      <w:r>
+        <w:drawing>
+          <wp:inline distT="0" distB="0" distL="0" distR="0">
+            <wp:extent cx="5486400" cy="3172300"/>
+            <wp:effectExtent l="0" t="0" r="0" b="0"/>
+            <wp:docPr id="1001" name="EvidenciaJest"/>
+            <wp:cNvGraphicFramePr>
+              <a:graphicFrameLocks xmlns:a="http://schemas.openxmlformats.org/drawingml/2006/main" noChangeAspect="1"/>
+            </wp:cNvGraphicFramePr>
+            <a:graphic xmlns:a="http://schemas.openxmlformats.org/drawingml/2006/main">
+              <a:graphicData uri="http://schemas.openxmlformats.org/drawingml/2006/picture">
+                <pic:pic xmlns:pic="http://schemas.openxmlformats.org/drawingml/2006/picture">
+                  <pic:nvPicPr>
+                    <pic:cNvPr id="1001" name="EvidenciaJest.png"/>
+                    <pic:cNvPicPr/>
+                  </pic:nvPicPr>
+                  <pic:blipFill>
+                    <a:blip r:embed="rId8"/>
+                    <a:stretch>
+                      <a:fillRect/>
+                    </a:stretch>
+                  </pic:blipFill>
+                  <pic:spPr>
+                    <a:xfrm>
+                      <a:off x="0" y="0"/>
+                      <a:ext cx="5486400" cy="3172300"/>
+                    </a:xfrm>
+                    <a:prstGeom prst="rect">
+                      <a:avLst/>
+                    </a:prstGeom>
+                  </pic:spPr>
+                </pic:pic>
+              </a:graphicData>
+            </a:graphic>
+          </wp:inline>
+        </w:drawing>
+      </w:r>
+    </w:p>
+    <w:p>
+      <w:pPr>
         <w:spacing w:before="60" w:after="200"/>
       </w:pPr>
       <w:r>
@@ -5773,6 +5816,49 @@
           <w:rFonts w:ascii="Consolas" w:cs="Consolas" w:eastAsia="Consolas" w:hAnsi="Consolas"/>
         </w:rPr>
         <w:t xml:space="preserve">i tests 6   |   i pass 6   |   i fail 0</w:t>
+      </w:r>
+    </w:p>
+    <w:p>
+      <w:pPr>
+        <w:spacing w:before="120" w:after="120"/>
+        <w:jc w:val="center"/>
+      </w:pPr>
+      <w:r>
+        <w:drawing>
+          <wp:inline distT="0" distB="0" distL="0" distR="0">
+            <wp:extent cx="4572000" cy="2297188"/>
+            <wp:effectExtent l="0" t="0" r="0" b="0"/>
+            <wp:docPr id="1002" name="EvidenciaNodeTest"/>
+            <wp:cNvGraphicFramePr>
+              <a:graphicFrameLocks xmlns:a="http://schemas.openxmlformats.org/drawingml/2006/main" noChangeAspect="1"/>
+            </wp:cNvGraphicFramePr>
+            <a:graphic xmlns:a="http://schemas.openxmlformats.org/drawingml/2006/main">
+              <a:graphicData uri="http://schemas.openxmlformats.org/drawingml/2006/picture">
+                <pic:pic xmlns:pic="http://schemas.openxmlformats.org/drawingml/2006/picture">
+                  <pic:nvPicPr>
+                    <pic:cNvPr id="1002" name="EvidenciaNodeTest.png"/>
+                    <pic:cNvPicPr/>
+                  </pic:nvPicPr>
+                  <pic:blipFill>
+                    <a:blip r:embed="rId9"/>
+                    <a:stretch>
+                      <a:fillRect/>
+                    </a:stretch>
+                  </pic:blipFill>
+                  <pic:spPr>
+                    <a:xfrm>
+                      <a:off x="0" y="0"/>
+                      <a:ext cx="4572000" cy="2297188"/>
+                    </a:xfrm>
+                    <a:prstGeom prst="rect">
+                      <a:avLst/>
+                    </a:prstGeom>
+                  </pic:spPr>
+                </pic:pic>
+              </a:graphicData>
+            </a:graphic>
+          </wp:inline>
+        </w:drawing>
       </w:r>
     </w:p>
     <w:p>

</xml_diff>